<commit_message>
Uploading the final_report and assignments
</commit_message>
<xml_diff>
--- a/Seminar_on_EU-First.docx
+++ b/Seminar_on_EU-First.docx
@@ -4,7 +4,7 @@
   <w:body>
     <w:p>
       <w:pPr>
-        <w:spacing w:afterLines="2600" w:after="9360"/>
+        <w:spacing w:afterLines="600" w:after="2160"/>
         <w:jc w:val="center"/>
         <w:rPr>
           <w:rFonts w:ascii="Times New Roman" w:eastAsia="標楷體" w:hAnsi="Times New Roman"/>
@@ -30,35 +30,40 @@
       </w:r>
       <w:r>
         <w:rPr>
+          <w:rFonts w:ascii="Times New Roman" w:eastAsia="標楷體" w:hAnsi="Times New Roman"/>
+          <w:sz w:val="36"/>
+          <w:szCs w:val="36"/>
+        </w:rPr>
+        <w:t>First</w:t>
+      </w:r>
+      <w:r>
+        <w:rPr>
           <w:rFonts w:ascii="Times New Roman" w:eastAsia="標楷體" w:hAnsi="Times New Roman" w:hint="eastAsia"/>
           <w:sz w:val="36"/>
           <w:szCs w:val="36"/>
         </w:rPr>
-        <w:t>Reading-Report</w:t>
-      </w:r>
-    </w:p>
-    <w:p>
-      <w:pPr>
-        <w:spacing w:after="0"/>
-        <w:jc w:val="center"/>
+        <w:t xml:space="preserve"> </w:t>
+      </w:r>
+      <w:r>
         <w:rPr>
           <w:rFonts w:ascii="Times New Roman" w:eastAsia="標楷體" w:hAnsi="Times New Roman"/>
           <w:sz w:val="36"/>
           <w:szCs w:val="36"/>
         </w:rPr>
-      </w:pPr>
+        <w:t>Reading</w:t>
+      </w:r>
       <w:r>
         <w:rPr>
           <w:rFonts w:ascii="Times New Roman" w:eastAsia="標楷體" w:hAnsi="Times New Roman" w:hint="eastAsia"/>
           <w:sz w:val="36"/>
           <w:szCs w:val="36"/>
         </w:rPr>
-        <w:t>Department of Computer Science and Information Technology</w:t>
-      </w:r>
-    </w:p>
-    <w:p>
-      <w:pPr>
-        <w:spacing w:after="0"/>
+        <w:t>-Report</w:t>
+      </w:r>
+    </w:p>
+    <w:p>
+      <w:pPr>
+        <w:spacing w:afterLines="700" w:after="2520"/>
         <w:jc w:val="center"/>
         <w:rPr>
           <w:rFonts w:ascii="Times New Roman" w:eastAsia="標楷體" w:hAnsi="Times New Roman"/>
@@ -68,27 +73,110 @@
       </w:pPr>
       <w:r>
         <w:rPr>
+          <w:rFonts w:ascii="Times New Roman" w:eastAsia="標楷體" w:hAnsi="Times New Roman"/>
+          <w:noProof/>
+          <w:sz w:val="36"/>
+          <w:szCs w:val="36"/>
+        </w:rPr>
+        <w:drawing>
+          <wp:inline distT="0" distB="0" distL="0" distR="0" wp14:anchorId="4C158624" wp14:editId="777819FE">
+            <wp:extent cx="2811600" cy="2800800"/>
+            <wp:effectExtent l="0" t="0" r="0" b="0"/>
+            <wp:docPr id="701477692" name="Picture 4" descr="A logo with a bell and palm trees"/>
+            <wp:cNvGraphicFramePr>
+              <a:graphicFrameLocks xmlns:a="http://schemas.openxmlformats.org/drawingml/2006/main" noChangeAspect="1"/>
+            </wp:cNvGraphicFramePr>
+            <a:graphic xmlns:a="http://schemas.openxmlformats.org/drawingml/2006/main">
+              <a:graphicData uri="http://schemas.openxmlformats.org/drawingml/2006/picture">
+                <pic:pic xmlns:pic="http://schemas.openxmlformats.org/drawingml/2006/picture">
+                  <pic:nvPicPr>
+                    <pic:cNvPr id="701477692" name="Picture 4" descr="A logo with a bell and palm trees"/>
+                    <pic:cNvPicPr/>
+                  </pic:nvPicPr>
+                  <pic:blipFill>
+                    <a:blip r:embed="rId8">
+                      <a:alphaModFix amt="40000"/>
+                      <a:extLst>
+                        <a:ext uri="{28A0092B-C50C-407E-A947-70E740481C1C}">
+                          <a14:useLocalDpi xmlns:a14="http://schemas.microsoft.com/office/drawing/2010/main" val="0"/>
+                        </a:ext>
+                      </a:extLst>
+                    </a:blip>
+                    <a:stretch>
+                      <a:fillRect/>
+                    </a:stretch>
+                  </pic:blipFill>
+                  <pic:spPr>
+                    <a:xfrm>
+                      <a:off x="0" y="0"/>
+                      <a:ext cx="2811600" cy="2800800"/>
+                    </a:xfrm>
+                    <a:prstGeom prst="rect">
+                      <a:avLst/>
+                    </a:prstGeom>
+                  </pic:spPr>
+                </pic:pic>
+              </a:graphicData>
+            </a:graphic>
+          </wp:inline>
+        </w:drawing>
+      </w:r>
+    </w:p>
+    <w:p>
+      <w:pPr>
+        <w:spacing w:after="0"/>
+        <w:jc w:val="center"/>
+        <w:rPr>
+          <w:rFonts w:ascii="Times New Roman" w:eastAsia="標楷體" w:hAnsi="Times New Roman"/>
+          <w:sz w:val="36"/>
+          <w:szCs w:val="36"/>
+        </w:rPr>
+      </w:pPr>
+      <w:r>
+        <w:rPr>
           <w:rFonts w:ascii="Times New Roman" w:eastAsia="標楷體" w:hAnsi="Times New Roman" w:hint="eastAsia"/>
           <w:sz w:val="36"/>
           <w:szCs w:val="36"/>
         </w:rPr>
-        <w:t>Vincent</w:t>
-      </w:r>
+        <w:t xml:space="preserve">Department of Computer Science and </w:t>
+      </w:r>
+    </w:p>
+    <w:p>
+      <w:pPr>
+        <w:spacing w:after="0"/>
+        <w:jc w:val="center"/>
+        <w:rPr>
+          <w:rFonts w:ascii="Times New Roman" w:eastAsia="標楷體" w:hAnsi="Times New Roman"/>
+          <w:sz w:val="36"/>
+          <w:szCs w:val="36"/>
+        </w:rPr>
+      </w:pPr>
       <w:r>
         <w:rPr>
           <w:rFonts w:ascii="Times New Roman" w:eastAsia="標楷體" w:hAnsi="Times New Roman" w:hint="eastAsia"/>
           <w:sz w:val="36"/>
           <w:szCs w:val="36"/>
         </w:rPr>
-        <w:t xml:space="preserve">, </w:t>
-      </w:r>
+        <w:t>Information Technology</w:t>
+      </w:r>
+    </w:p>
+    <w:p>
+      <w:pPr>
+        <w:spacing w:after="0"/>
+        <w:jc w:val="center"/>
+        <w:rPr>
+          <w:rFonts w:ascii="Times New Roman" w:eastAsia="標楷體" w:hAnsi="Times New Roman"/>
+          <w:sz w:val="36"/>
+          <w:szCs w:val="36"/>
+        </w:rPr>
+      </w:pPr>
       <w:r>
         <w:rPr>
           <w:rFonts w:ascii="Times New Roman" w:eastAsia="標楷體" w:hAnsi="Times New Roman" w:hint="eastAsia"/>
           <w:sz w:val="36"/>
           <w:szCs w:val="36"/>
         </w:rPr>
-        <w:t>Ts</w:t>
+        <w:t>Min</w:t>
       </w:r>
       <w:r>
         <w:rPr>
@@ -96,7 +184,7 @@
           <w:sz w:val="36"/>
           <w:szCs w:val="36"/>
         </w:rPr>
-        <w:t>ai</w:t>
+        <w:t>-</w:t>
       </w:r>
       <w:r>
         <w:rPr>
@@ -104,7 +192,7 @@
           <w:sz w:val="36"/>
           <w:szCs w:val="36"/>
         </w:rPr>
-        <w:t>-</w:t>
+        <w:t>Sheng</w:t>
       </w:r>
       <w:r>
         <w:rPr>
@@ -112,30 +200,15 @@
           <w:sz w:val="36"/>
           <w:szCs w:val="36"/>
         </w:rPr>
-        <w:t>蔡旻盛</w:t>
-      </w:r>
-    </w:p>
-    <w:p>
-      <w:pPr>
-        <w:pStyle w:val="ListParagraph"/>
-        <w:numPr>
-          <w:ilvl w:val="0"/>
-          <w:numId w:val="1"/>
-        </w:numPr>
-        <w:rPr>
-          <w:rFonts w:ascii="Times New Roman" w:eastAsia="標楷體" w:hAnsi="Times New Roman"/>
-          <w:sz w:val="36"/>
-          <w:szCs w:val="36"/>
-        </w:rPr>
-      </w:pPr>
+        <w:t xml:space="preserve">, </w:t>
+      </w:r>
       <w:r>
         <w:rPr>
           <w:rFonts w:ascii="Times New Roman" w:eastAsia="標楷體" w:hAnsi="Times New Roman" w:hint="eastAsia"/>
           <w:sz w:val="36"/>
           <w:szCs w:val="36"/>
         </w:rPr>
-        <w:lastRenderedPageBreak/>
-        <w:t xml:space="preserve">Hua </w:t>
+        <w:t>Ts</w:t>
       </w:r>
       <w:r>
         <w:rPr>
@@ -143,7 +216,7 @@
           <w:sz w:val="36"/>
           <w:szCs w:val="36"/>
         </w:rPr>
-        <w:t>W</w:t>
+        <w:t>ai</w:t>
       </w:r>
       <w:r>
         <w:rPr>
@@ -151,7 +224,7 @@
           <w:sz w:val="36"/>
           <w:szCs w:val="36"/>
         </w:rPr>
-        <w:t>ei data privac</w:t>
+        <w:t>-</w:t>
       </w:r>
       <w:r>
         <w:rPr>
@@ -159,15 +232,1078 @@
           <w:sz w:val="36"/>
           <w:szCs w:val="36"/>
         </w:rPr>
+        <w:t>蔡旻盛</w:t>
+      </w:r>
+    </w:p>
+    <w:sdt>
+      <w:sdtPr>
+        <w:rPr>
+          <w:rFonts w:asciiTheme="minorHAnsi" w:eastAsiaTheme="minorEastAsia" w:hAnsiTheme="minorHAnsi" w:cstheme="minorBidi"/>
+          <w:color w:val="auto"/>
+          <w:kern w:val="2"/>
+          <w:sz w:val="24"/>
+          <w:szCs w:val="24"/>
+          <w:lang w:eastAsia="zh-TW"/>
+        </w:rPr>
+        <w:id w:val="677312882"/>
+        <w:docPartObj>
+          <w:docPartGallery w:val="Table of Contents"/>
+          <w:docPartUnique/>
+        </w:docPartObj>
+      </w:sdtPr>
+      <w:sdtEndPr>
+        <w:rPr>
+          <w:b/>
+          <w:bCs/>
+          <w:noProof/>
+        </w:rPr>
+      </w:sdtEndPr>
+      <w:sdtContent>
+        <w:p>
+          <w:pPr>
+            <w:pStyle w:val="TOCHeading"/>
+          </w:pPr>
+          <w:r>
+            <w:t>Table of Contents</w:t>
+          </w:r>
+        </w:p>
+        <w:p>
+          <w:pPr>
+            <w:pStyle w:val="TOC1"/>
+            <w:tabs>
+              <w:tab w:val="right" w:leader="dot" w:pos="8296"/>
+            </w:tabs>
+            <w:rPr>
+              <w:noProof/>
+            </w:rPr>
+          </w:pPr>
+          <w:r>
+            <w:fldChar w:fldCharType="begin"/>
+          </w:r>
+          <w:r>
+            <w:instrText xml:space="preserve"> TOC \o "1-3" \h \z \u </w:instrText>
+          </w:r>
+          <w:r>
+            <w:fldChar w:fldCharType="separate"/>
+          </w:r>
+          <w:hyperlink w:anchor="_Toc170919532" w:history="1">
+            <w:r>
+              <w:rPr>
+                <w:rStyle w:val="Hyperlink"/>
+                <w:noProof/>
+              </w:rPr>
+              <w:t>Hua Wei data privacy:</w:t>
+            </w:r>
+            <w:r>
+              <w:rPr>
+                <w:noProof/>
+                <w:webHidden/>
+              </w:rPr>
+              <w:tab/>
+            </w:r>
+            <w:r>
+              <w:rPr>
+                <w:noProof/>
+                <w:webHidden/>
+              </w:rPr>
+              <w:fldChar w:fldCharType="begin"/>
+            </w:r>
+            <w:r>
+              <w:rPr>
+                <w:noProof/>
+                <w:webHidden/>
+              </w:rPr>
+              <w:instrText xml:space="preserve"> PAGEREF _Toc170919532 \h </w:instrText>
+            </w:r>
+            <w:r>
+              <w:rPr>
+                <w:noProof/>
+                <w:webHidden/>
+              </w:rPr>
+            </w:r>
+            <w:r>
+              <w:rPr>
+                <w:noProof/>
+                <w:webHidden/>
+              </w:rPr>
+              <w:fldChar w:fldCharType="separate"/>
+            </w:r>
+            <w:r>
+              <w:rPr>
+                <w:noProof/>
+                <w:webHidden/>
+              </w:rPr>
+              <w:t>2</w:t>
+            </w:r>
+            <w:r>
+              <w:rPr>
+                <w:noProof/>
+                <w:webHidden/>
+              </w:rPr>
+              <w:fldChar w:fldCharType="end"/>
+            </w:r>
+          </w:hyperlink>
+        </w:p>
+        <w:p>
+          <w:pPr>
+            <w:pStyle w:val="TOC1"/>
+            <w:tabs>
+              <w:tab w:val="right" w:leader="dot" w:pos="8296"/>
+            </w:tabs>
+            <w:rPr>
+              <w:noProof/>
+            </w:rPr>
+          </w:pPr>
+          <w:hyperlink w:anchor="_Toc170919533" w:history="1">
+            <w:r>
+              <w:rPr>
+                <w:rStyle w:val="Hyperlink"/>
+                <w:noProof/>
+              </w:rPr>
+              <w:t>Global_Wafers (TSMC) Move to Germany</w:t>
+            </w:r>
+            <w:r>
+              <w:rPr>
+                <w:noProof/>
+                <w:webHidden/>
+              </w:rPr>
+              <w:tab/>
+            </w:r>
+            <w:r>
+              <w:rPr>
+                <w:noProof/>
+                <w:webHidden/>
+              </w:rPr>
+              <w:fldChar w:fldCharType="begin"/>
+            </w:r>
+            <w:r>
+              <w:rPr>
+                <w:noProof/>
+                <w:webHidden/>
+              </w:rPr>
+              <w:instrText xml:space="preserve"> PAGEREF _Toc170919533 \h </w:instrText>
+            </w:r>
+            <w:r>
+              <w:rPr>
+                <w:noProof/>
+                <w:webHidden/>
+              </w:rPr>
+            </w:r>
+            <w:r>
+              <w:rPr>
+                <w:noProof/>
+                <w:webHidden/>
+              </w:rPr>
+              <w:fldChar w:fldCharType="separate"/>
+            </w:r>
+            <w:r>
+              <w:rPr>
+                <w:noProof/>
+                <w:webHidden/>
+              </w:rPr>
+              <w:t>4</w:t>
+            </w:r>
+            <w:r>
+              <w:rPr>
+                <w:noProof/>
+                <w:webHidden/>
+              </w:rPr>
+              <w:fldChar w:fldCharType="end"/>
+            </w:r>
+          </w:hyperlink>
+        </w:p>
+        <w:p>
+          <w:pPr>
+            <w:pStyle w:val="TOC1"/>
+            <w:tabs>
+              <w:tab w:val="right" w:leader="dot" w:pos="8296"/>
+            </w:tabs>
+            <w:rPr>
+              <w:noProof/>
+            </w:rPr>
+          </w:pPr>
+          <w:hyperlink w:anchor="_Toc170919534" w:history="1">
+            <w:r>
+              <w:rPr>
+                <w:rStyle w:val="Hyperlink"/>
+                <w:noProof/>
+              </w:rPr>
+              <w:t>Reference</w:t>
+            </w:r>
+            <w:r>
+              <w:rPr>
+                <w:noProof/>
+                <w:webHidden/>
+              </w:rPr>
+              <w:tab/>
+            </w:r>
+            <w:r>
+              <w:rPr>
+                <w:noProof/>
+                <w:webHidden/>
+              </w:rPr>
+              <w:fldChar w:fldCharType="begin"/>
+            </w:r>
+            <w:r>
+              <w:rPr>
+                <w:noProof/>
+                <w:webHidden/>
+              </w:rPr>
+              <w:instrText xml:space="preserve"> PAGEREF _Toc170919534 \h </w:instrText>
+            </w:r>
+            <w:r>
+              <w:rPr>
+                <w:noProof/>
+                <w:webHidden/>
+              </w:rPr>
+            </w:r>
+            <w:r>
+              <w:rPr>
+                <w:noProof/>
+                <w:webHidden/>
+              </w:rPr>
+              <w:fldChar w:fldCharType="separate"/>
+            </w:r>
+            <w:r>
+              <w:rPr>
+                <w:noProof/>
+                <w:webHidden/>
+              </w:rPr>
+              <w:t>6</w:t>
+            </w:r>
+            <w:r>
+              <w:rPr>
+                <w:noProof/>
+                <w:webHidden/>
+              </w:rPr>
+              <w:fldChar w:fldCharType="end"/>
+            </w:r>
+          </w:hyperlink>
+        </w:p>
+        <w:p>
+          <w:r>
+            <w:rPr>
+              <w:b/>
+              <w:bCs/>
+              <w:noProof/>
+            </w:rPr>
+            <w:fldChar w:fldCharType="end"/>
+          </w:r>
+        </w:p>
+      </w:sdtContent>
+    </w:sdt>
+    <w:p>
+      <w:pPr>
+        <w:pStyle w:val="Heading1"/>
+        <w:rPr>
+          <w:sz w:val="40"/>
+          <w:szCs w:val="40"/>
+        </w:rPr>
+      </w:pPr>
+      <w:bookmarkStart w:id="0" w:name="_Toc170919532"/>
+      <w:r>
+        <w:rPr>
+          <w:rFonts w:hint="eastAsia"/>
+          <w:sz w:val="40"/>
+          <w:szCs w:val="40"/>
+        </w:rPr>
+        <w:t xml:space="preserve">Hua </w:t>
+      </w:r>
+      <w:r>
+        <w:rPr>
+          <w:rFonts w:hint="eastAsia"/>
+          <w:sz w:val="40"/>
+          <w:szCs w:val="40"/>
+        </w:rPr>
+        <w:t>W</w:t>
+      </w:r>
+      <w:r>
+        <w:rPr>
+          <w:rFonts w:hint="eastAsia"/>
+          <w:sz w:val="40"/>
+          <w:szCs w:val="40"/>
+        </w:rPr>
+        <w:t>ei data privac</w:t>
+      </w:r>
+      <w:r>
+        <w:rPr>
+          <w:rFonts w:hint="eastAsia"/>
+          <w:sz w:val="40"/>
+          <w:szCs w:val="40"/>
+        </w:rPr>
         <w:t>y</w:t>
       </w:r>
       <w:r>
         <w:rPr>
-          <w:rFonts w:ascii="Times New Roman" w:eastAsia="標楷體" w:hAnsi="Times New Roman" w:hint="eastAsia"/>
-          <w:sz w:val="36"/>
-          <w:szCs w:val="36"/>
+          <w:rFonts w:hint="eastAsia"/>
+          <w:sz w:val="40"/>
+          <w:szCs w:val="40"/>
         </w:rPr>
         <w:t>:</w:t>
+      </w:r>
+      <w:bookmarkEnd w:id="0"/>
+    </w:p>
+    <w:p>
+      <w:pPr>
+        <w:spacing w:after="0"/>
+        <w:ind w:firstLine="480"/>
+        <w:rPr>
+          <w:rFonts w:ascii="Times New Roman" w:hAnsi="Times New Roman" w:cs="Times New Roman"/>
+          <w:color w:val="262626"/>
+          <w:shd w:val="clear" w:color="auto" w:fill="FFFFFF"/>
+        </w:rPr>
+      </w:pPr>
+      <w:r>
+        <w:rPr>
+          <w:rFonts w:ascii="Times New Roman" w:hAnsi="Times New Roman" w:cs="Times New Roman"/>
+          <w:color w:val="262626"/>
+          <w:shd w:val="clear" w:color="auto" w:fill="FFFFFF"/>
+        </w:rPr>
+        <w:t xml:space="preserve">Huawei Cloud is making good inroads into the South African market thanks to its </w:t>
+      </w:r>
+      <w:r>
+        <w:rPr>
+          <w:rFonts w:ascii="Times New Roman" w:hAnsi="Times New Roman" w:cs="Times New Roman"/>
+          <w:color w:val="0F9ED5" w:themeColor="accent4"/>
+          <w:shd w:val="clear" w:color="auto" w:fill="FFFFFF"/>
+        </w:rPr>
+        <w:t>security</w:t>
+      </w:r>
+      <w:r>
+        <w:rPr>
+          <w:rFonts w:ascii="Times New Roman" w:hAnsi="Times New Roman" w:cs="Times New Roman"/>
+          <w:color w:val="262626"/>
+          <w:shd w:val="clear" w:color="auto" w:fill="FFFFFF"/>
+        </w:rPr>
+        <w:t xml:space="preserve">, in-country data </w:t>
+      </w:r>
+      <w:r>
+        <w:rPr>
+          <w:rFonts w:ascii="Times New Roman" w:hAnsi="Times New Roman" w:cs="Times New Roman"/>
+          <w:color w:val="262626"/>
+          <w:shd w:val="clear" w:color="auto" w:fill="FFFFFF"/>
+        </w:rPr>
+        <w:t>centers</w:t>
+      </w:r>
+      <w:r>
+        <w:rPr>
+          <w:rFonts w:ascii="Times New Roman" w:hAnsi="Times New Roman" w:cs="Times New Roman"/>
+          <w:color w:val="262626"/>
+          <w:shd w:val="clear" w:color="auto" w:fill="FFFFFF"/>
+        </w:rPr>
+        <w:t>,</w:t>
+      </w:r>
+      <w:r>
+        <w:rPr>
+          <w:rFonts w:ascii="Times New Roman" w:hAnsi="Times New Roman" w:cs="Times New Roman"/>
+          <w:color w:val="262626"/>
+          <w:shd w:val="clear" w:color="auto" w:fill="FFFFFF"/>
+        </w:rPr>
+        <w:t xml:space="preserve"> and support</w:t>
+      </w:r>
+      <w:r>
+        <w:rPr>
+          <w:rFonts w:ascii="Times New Roman" w:hAnsi="Times New Roman" w:cs="Times New Roman" w:hint="eastAsia"/>
+          <w:color w:val="262626"/>
+          <w:shd w:val="clear" w:color="auto" w:fill="FFFFFF"/>
+        </w:rPr>
+        <w:t>.</w:t>
+      </w:r>
+    </w:p>
+    <w:p>
+      <w:pPr>
+        <w:jc w:val="both"/>
+        <w:rPr>
+          <w:rFonts w:ascii="Times New Roman" w:hAnsi="Times New Roman" w:cs="Times New Roman"/>
+          <w:color w:val="262626"/>
+          <w:shd w:val="clear" w:color="auto" w:fill="FFFFFF"/>
+        </w:rPr>
+      </w:pPr>
+      <w:r>
+        <w:rPr>
+          <w:rFonts w:ascii="Times New Roman" w:hAnsi="Times New Roman" w:cs="Times New Roman"/>
+          <w:color w:val="262626"/>
+          <w:shd w:val="clear" w:color="auto" w:fill="FFFFFF"/>
+        </w:rPr>
+        <w:t xml:space="preserve">Reflection on </w:t>
+      </w:r>
+      <w:r>
+        <w:rPr>
+          <w:rFonts w:ascii="Times New Roman" w:hAnsi="Times New Roman" w:cs="Times New Roman"/>
+          <w:color w:val="0F9ED5" w:themeColor="accent4"/>
+          <w:shd w:val="clear" w:color="auto" w:fill="FFFFFF"/>
+        </w:rPr>
+        <w:t>Huawei Data Privacy Concerns</w:t>
+      </w:r>
+      <w:r>
+        <w:rPr>
+          <w:rFonts w:ascii="Times New Roman" w:hAnsi="Times New Roman" w:cs="Times New Roman" w:hint="eastAsia"/>
+          <w:color w:val="0F9ED5" w:themeColor="accent4"/>
+          <w:shd w:val="clear" w:color="auto" w:fill="FFFFFF"/>
+        </w:rPr>
+        <w:t xml:space="preserve"> </w:t>
+      </w:r>
+    </w:p>
+    <w:p>
+      <w:pPr>
+        <w:ind w:firstLine="480"/>
+        <w:jc w:val="both"/>
+        <w:rPr>
+          <w:rFonts w:ascii="Times New Roman" w:hAnsi="Times New Roman" w:cs="Times New Roman"/>
+          <w:color w:val="262626"/>
+          <w:shd w:val="clear" w:color="auto" w:fill="FFFFFF"/>
+        </w:rPr>
+      </w:pPr>
+      <w:r>
+        <w:rPr>
+          <w:rFonts w:ascii="Times New Roman" w:hAnsi="Times New Roman" w:cs="Times New Roman"/>
+          <w:b/>
+          <w:bCs/>
+          <w:color w:val="262626"/>
+          <w:shd w:val="clear" w:color="auto" w:fill="FFFFFF"/>
+        </w:rPr>
+        <w:t>In recent years</w:t>
+      </w:r>
+      <w:r>
+        <w:rPr>
+          <w:rFonts w:ascii="Times New Roman" w:hAnsi="Times New Roman" w:cs="Times New Roman"/>
+          <w:color w:val="262626"/>
+          <w:shd w:val="clear" w:color="auto" w:fill="FFFFFF"/>
+        </w:rPr>
+        <w:t>, Huawei has been at the center of numerous controversies, with one of the most significant being concerns over data privacy. As the Chinese tech giant has expanded its global reach, questions about how it handles user data and its relationship with the Chinese government have become increasingly prevalent. Reflecting on this issue prompts considerations not only about Huawei's practices but also about broader implications for data privacy and international relations.</w:t>
+      </w:r>
+    </w:p>
+    <w:p>
+      <w:pPr>
+        <w:ind w:firstLine="480"/>
+        <w:jc w:val="both"/>
+        <w:rPr>
+          <w:rFonts w:ascii="Times New Roman" w:hAnsi="Times New Roman" w:cs="Times New Roman"/>
+          <w:color w:val="262626"/>
+          <w:shd w:val="clear" w:color="auto" w:fill="FFFFFF"/>
+        </w:rPr>
+      </w:pPr>
+      <w:r>
+        <w:rPr>
+          <w:rFonts w:ascii="Times New Roman" w:hAnsi="Times New Roman" w:cs="Times New Roman"/>
+          <w:color w:val="262626"/>
+          <w:shd w:val="clear" w:color="auto" w:fill="FFFFFF"/>
+        </w:rPr>
+        <w:t xml:space="preserve">At the heart of the Huawei data privacy debate </w:t>
+      </w:r>
+      <w:r>
+        <w:rPr>
+          <w:rFonts w:ascii="Times New Roman" w:hAnsi="Times New Roman" w:cs="Times New Roman"/>
+          <w:color w:val="0F9ED5" w:themeColor="accent4"/>
+          <w:shd w:val="clear" w:color="auto" w:fill="FFFFFF"/>
+        </w:rPr>
+        <w:t>lies the concern that the company may be subject to Chinese government influence or control</w:t>
+      </w:r>
+      <w:r>
+        <w:rPr>
+          <w:rFonts w:ascii="Times New Roman" w:hAnsi="Times New Roman" w:cs="Times New Roman"/>
+          <w:color w:val="262626"/>
+          <w:shd w:val="clear" w:color="auto" w:fill="FFFFFF"/>
+        </w:rPr>
+        <w:t xml:space="preserve">, raising questions about the security and privacy of user data. </w:t>
+      </w:r>
+      <w:r>
+        <w:rPr>
+          <w:rFonts w:ascii="Times New Roman" w:hAnsi="Times New Roman" w:cs="Times New Roman"/>
+          <w:color w:val="0F9ED5" w:themeColor="accent4"/>
+          <w:shd w:val="clear" w:color="auto" w:fill="FFFFFF"/>
+        </w:rPr>
+        <w:t>The fear is that Huawei could be compelled to provide sensitive information to Chinese authorities,</w:t>
+      </w:r>
+      <w:r>
+        <w:rPr>
+          <w:rFonts w:ascii="Times New Roman" w:hAnsi="Times New Roman" w:cs="Times New Roman"/>
+          <w:color w:val="262626"/>
+          <w:shd w:val="clear" w:color="auto" w:fill="FFFFFF"/>
+        </w:rPr>
+        <w:t xml:space="preserve"> either voluntarily or through legal mandates, posing risks to user privacy and national security in countries where Huawei operates.</w:t>
+      </w:r>
+    </w:p>
+    <w:p>
+      <w:pPr>
+        <w:ind w:firstLine="480"/>
+        <w:jc w:val="both"/>
+        <w:rPr>
+          <w:rFonts w:ascii="Times New Roman" w:hAnsi="Times New Roman" w:cs="Times New Roman"/>
+          <w:color w:val="262626"/>
+          <w:shd w:val="clear" w:color="auto" w:fill="FFFFFF"/>
+        </w:rPr>
+      </w:pPr>
+      <w:r>
+        <w:rPr>
+          <w:rFonts w:ascii="Times New Roman" w:hAnsi="Times New Roman" w:cs="Times New Roman"/>
+          <w:color w:val="E97132" w:themeColor="accent2"/>
+          <w:shd w:val="clear" w:color="auto" w:fill="FFFFFF"/>
+        </w:rPr>
+        <w:t xml:space="preserve">This issue raises fundamental questions </w:t>
+      </w:r>
+      <w:r>
+        <w:rPr>
+          <w:rFonts w:ascii="Times New Roman" w:hAnsi="Times New Roman" w:cs="Times New Roman"/>
+          <w:color w:val="262626"/>
+          <w:shd w:val="clear" w:color="auto" w:fill="FFFFFF"/>
+        </w:rPr>
+        <w:t>about the balance</w:t>
+      </w:r>
+      <w:r>
+        <w:rPr>
+          <w:rFonts w:ascii="Times New Roman" w:hAnsi="Times New Roman" w:cs="Times New Roman"/>
+          <w:color w:val="0F9ED5" w:themeColor="accent4"/>
+          <w:shd w:val="clear" w:color="auto" w:fill="FFFFFF"/>
+        </w:rPr>
+        <w:t xml:space="preserve"> between national security interests</w:t>
+      </w:r>
+      <w:r>
+        <w:rPr>
+          <w:rFonts w:ascii="Times New Roman" w:hAnsi="Times New Roman" w:cs="Times New Roman"/>
+          <w:color w:val="262626"/>
+          <w:shd w:val="clear" w:color="auto" w:fill="FFFFFF"/>
+        </w:rPr>
+        <w:t xml:space="preserve"> and the</w:t>
+      </w:r>
+      <w:r>
+        <w:rPr>
+          <w:rFonts w:ascii="Times New Roman" w:hAnsi="Times New Roman" w:cs="Times New Roman"/>
+          <w:color w:val="0F9ED5" w:themeColor="accent4"/>
+          <w:shd w:val="clear" w:color="auto" w:fill="FFFFFF"/>
+        </w:rPr>
+        <w:t xml:space="preserve"> principles of data privacy</w:t>
+      </w:r>
+      <w:r>
+        <w:rPr>
+          <w:rFonts w:ascii="Times New Roman" w:hAnsi="Times New Roman" w:cs="Times New Roman"/>
+          <w:color w:val="262626"/>
+          <w:shd w:val="clear" w:color="auto" w:fill="FFFFFF"/>
+        </w:rPr>
+        <w:t xml:space="preserve"> and </w:t>
+      </w:r>
+      <w:r>
+        <w:rPr>
+          <w:rFonts w:ascii="Times New Roman" w:hAnsi="Times New Roman" w:cs="Times New Roman"/>
+          <w:color w:val="0F9ED5" w:themeColor="accent4"/>
+          <w:shd w:val="clear" w:color="auto" w:fill="FFFFFF"/>
+        </w:rPr>
+        <w:t>user rights</w:t>
+      </w:r>
+      <w:r>
+        <w:rPr>
+          <w:rFonts w:ascii="Times New Roman" w:hAnsi="Times New Roman" w:cs="Times New Roman"/>
+          <w:color w:val="262626"/>
+          <w:shd w:val="clear" w:color="auto" w:fill="FFFFFF"/>
+        </w:rPr>
+        <w:t xml:space="preserve">. Governments around the world are grappling with how to address these concerns while also benefiting from the technological advancements and economic opportunities that companies like Huawei offer. It underscores the need for robust regulatory frameworks and international cooperation to safeguard data privacy in an increasingly </w:t>
+      </w:r>
+      <w:r>
+        <w:rPr>
+          <w:rFonts w:ascii="Times New Roman" w:hAnsi="Times New Roman" w:cs="Times New Roman"/>
+          <w:color w:val="262626"/>
+          <w:shd w:val="clear" w:color="auto" w:fill="FFFFFF"/>
+        </w:rPr>
+        <w:lastRenderedPageBreak/>
+        <w:t>interconnected world.</w:t>
+      </w:r>
+    </w:p>
+    <w:p>
+      <w:pPr>
+        <w:ind w:firstLine="480"/>
+        <w:jc w:val="both"/>
+        <w:rPr>
+          <w:rFonts w:ascii="Times New Roman" w:hAnsi="Times New Roman" w:cs="Times New Roman"/>
+          <w:color w:val="262626"/>
+          <w:shd w:val="clear" w:color="auto" w:fill="FFFFFF"/>
+        </w:rPr>
+      </w:pPr>
+      <w:r>
+        <w:rPr>
+          <w:rFonts w:ascii="Times New Roman" w:hAnsi="Times New Roman" w:cs="Times New Roman"/>
+          <w:color w:val="262626"/>
+          <w:shd w:val="clear" w:color="auto" w:fill="FFFFFF"/>
+        </w:rPr>
+        <w:t xml:space="preserve">From a personal perspective, the Huawei data privacy concerns serve as a reminder of the importance of being vigilant about the technologies and platforms we entrust with our data. As individuals, </w:t>
+      </w:r>
+      <w:r>
+        <w:rPr>
+          <w:rFonts w:ascii="Times New Roman" w:hAnsi="Times New Roman" w:cs="Times New Roman"/>
+          <w:color w:val="0F9ED5" w:themeColor="accent4"/>
+          <w:shd w:val="clear" w:color="auto" w:fill="FFFFFF"/>
+        </w:rPr>
+        <w:t>we must be aware of the potential risks and take steps to protect our privacy,</w:t>
+      </w:r>
+      <w:r>
+        <w:rPr>
+          <w:rFonts w:ascii="Times New Roman" w:hAnsi="Times New Roman" w:cs="Times New Roman"/>
+          <w:color w:val="262626"/>
+          <w:shd w:val="clear" w:color="auto" w:fill="FFFFFF"/>
+        </w:rPr>
+        <w:t xml:space="preserve"> whether through understanding privacy policies, using encryption tools, or advocating for stronger data protection laws.</w:t>
+      </w:r>
+    </w:p>
+    <w:p>
+      <w:pPr>
+        <w:ind w:firstLineChars="200" w:firstLine="480"/>
+        <w:jc w:val="both"/>
+        <w:rPr>
+          <w:rFonts w:ascii="Times New Roman" w:hAnsi="Times New Roman" w:cs="Times New Roman"/>
+          <w:color w:val="262626"/>
+          <w:shd w:val="clear" w:color="auto" w:fill="FFFFFF"/>
+        </w:rPr>
+      </w:pPr>
+      <w:r>
+        <w:rPr>
+          <w:rFonts w:ascii="Times New Roman" w:hAnsi="Times New Roman" w:cs="Times New Roman"/>
+          <w:color w:val="262626"/>
+          <w:shd w:val="clear" w:color="auto" w:fill="FFFFFF"/>
+        </w:rPr>
+        <w:t>In conclusion, t</w:t>
+      </w:r>
+      <w:r>
+        <w:rPr>
+          <w:rFonts w:ascii="Times New Roman" w:hAnsi="Times New Roman" w:cs="Times New Roman"/>
+          <w:color w:val="E97132" w:themeColor="accent2"/>
+          <w:shd w:val="clear" w:color="auto" w:fill="FFFFFF"/>
+        </w:rPr>
+        <w:t>he Huawei data privacy concerns</w:t>
+      </w:r>
+      <w:r>
+        <w:rPr>
+          <w:rFonts w:ascii="Times New Roman" w:hAnsi="Times New Roman" w:cs="Times New Roman"/>
+          <w:color w:val="262626"/>
+          <w:shd w:val="clear" w:color="auto" w:fill="FFFFFF"/>
+        </w:rPr>
+        <w:t xml:space="preserve"> represent a</w:t>
+      </w:r>
+      <w:r>
+        <w:rPr>
+          <w:rFonts w:ascii="Times New Roman" w:hAnsi="Times New Roman" w:cs="Times New Roman"/>
+          <w:color w:val="0F9ED5" w:themeColor="accent4"/>
+          <w:shd w:val="clear" w:color="auto" w:fill="FFFFFF"/>
+        </w:rPr>
+        <w:t xml:space="preserve"> multifaceted issue with far-reaching implications</w:t>
+      </w:r>
+      <w:r>
+        <w:rPr>
+          <w:rFonts w:ascii="Times New Roman" w:hAnsi="Times New Roman" w:cs="Times New Roman"/>
+          <w:color w:val="262626"/>
+          <w:shd w:val="clear" w:color="auto" w:fill="FFFFFF"/>
+        </w:rPr>
+        <w:t xml:space="preserve"> for individuals, governments, and the global tech industry. Addressing these concerns requires a balanced approach that upholds both privacy rights and national security interests while fostering transparency, accountability, and cooperation among stakeholders. As we navigate the complexities of the digital age, it is imperative that we remain </w:t>
+      </w:r>
+      <w:r>
+        <w:rPr>
+          <w:rFonts w:ascii="Times New Roman" w:hAnsi="Times New Roman" w:cs="Times New Roman" w:hint="eastAsia"/>
+          <w:color w:val="262626"/>
+          <w:shd w:val="clear" w:color="auto" w:fill="FFFFFF"/>
+        </w:rPr>
+        <w:t>alert</w:t>
+      </w:r>
+      <w:r>
+        <w:rPr>
+          <w:rFonts w:ascii="Times New Roman" w:hAnsi="Times New Roman" w:cs="Times New Roman"/>
+          <w:color w:val="262626"/>
+          <w:shd w:val="clear" w:color="auto" w:fill="FFFFFF"/>
+        </w:rPr>
+        <w:t xml:space="preserve"> and engaged in shaping policies and practices that promote a safe and secure digital environment for all.</w:t>
+      </w:r>
+    </w:p>
+    <w:p>
+      <w:pPr>
+        <w:widowControl/>
+        <w:rPr>
+          <w:rFonts w:ascii="Times New Roman" w:hAnsi="Times New Roman" w:cs="Times New Roman"/>
+          <w:color w:val="262626"/>
+          <w:shd w:val="clear" w:color="auto" w:fill="FFFFFF"/>
+        </w:rPr>
+      </w:pPr>
+      <w:r>
+        <w:rPr>
+          <w:rFonts w:ascii="Times New Roman" w:hAnsi="Times New Roman" w:cs="Times New Roman"/>
+          <w:color w:val="262626"/>
+          <w:shd w:val="clear" w:color="auto" w:fill="FFFFFF"/>
+        </w:rPr>
+        <w:br w:type="page"/>
+      </w:r>
+    </w:p>
+    <w:p>
+      <w:pPr>
+        <w:pStyle w:val="Heading1"/>
+        <w:rPr>
+          <w:sz w:val="40"/>
+          <w:szCs w:val="40"/>
+        </w:rPr>
+      </w:pPr>
+      <w:bookmarkStart w:id="1" w:name="_Toc170919533"/>
+      <w:proofErr w:type="spellStart"/>
+      <w:r>
+        <w:rPr>
+          <w:sz w:val="40"/>
+          <w:szCs w:val="40"/>
+        </w:rPr>
+        <w:lastRenderedPageBreak/>
+        <w:t>Global_Wafers</w:t>
+      </w:r>
+      <w:proofErr w:type="spellEnd"/>
+      <w:r>
+        <w:rPr>
+          <w:sz w:val="40"/>
+          <w:szCs w:val="40"/>
+        </w:rPr>
+        <w:t xml:space="preserve"> </w:t>
+      </w:r>
+      <w:r>
+        <w:rPr>
+          <w:rFonts w:hint="eastAsia"/>
+          <w:sz w:val="40"/>
+          <w:szCs w:val="40"/>
+        </w:rPr>
+        <w:t>(</w:t>
+      </w:r>
+      <w:r>
+        <w:rPr>
+          <w:rFonts w:hint="eastAsia"/>
+          <w:sz w:val="40"/>
+          <w:szCs w:val="40"/>
+        </w:rPr>
+        <w:t>TSMC</w:t>
+      </w:r>
+      <w:r>
+        <w:rPr>
+          <w:rFonts w:hint="eastAsia"/>
+          <w:sz w:val="40"/>
+          <w:szCs w:val="40"/>
+        </w:rPr>
+        <w:t>)</w:t>
+      </w:r>
+      <w:r>
+        <w:rPr>
+          <w:rFonts w:hint="eastAsia"/>
+          <w:sz w:val="40"/>
+          <w:szCs w:val="40"/>
+        </w:rPr>
+        <w:t xml:space="preserve"> Move to </w:t>
+      </w:r>
+      <w:r>
+        <w:rPr>
+          <w:sz w:val="40"/>
+          <w:szCs w:val="40"/>
+        </w:rPr>
+        <w:t>Germany</w:t>
+      </w:r>
+      <w:bookmarkEnd w:id="1"/>
+      <w:r>
+        <w:rPr>
+          <w:rFonts w:hint="eastAsia"/>
+          <w:sz w:val="40"/>
+          <w:szCs w:val="40"/>
+        </w:rPr>
+        <w:t xml:space="preserve"> </w:t>
+      </w:r>
+    </w:p>
+    <w:p>
+      <w:pPr>
+        <w:pStyle w:val="ListParagraph"/>
+        <w:ind w:left="482" w:firstLineChars="200" w:firstLine="480"/>
+        <w:rPr>
+          <w:rFonts w:ascii="Times New Roman" w:hAnsi="Times New Roman" w:cs="Times New Roman"/>
+          <w:color w:val="262626"/>
+          <w:shd w:val="clear" w:color="auto" w:fill="FFFFFF"/>
+        </w:rPr>
+      </w:pPr>
+      <w:r>
+        <w:rPr>
+          <w:rFonts w:ascii="Times New Roman" w:hAnsi="Times New Roman" w:cs="Times New Roman"/>
+          <w:color w:val="0F9ED5" w:themeColor="accent4"/>
+          <w:shd w:val="clear" w:color="auto" w:fill="FFFFFF"/>
+        </w:rPr>
+        <w:t>It was Feb. 1, 2022, the first day of the Year of the Tiger. The clock was winding down, and when it hit 6:59 a.m.</w:t>
+      </w:r>
+      <w:r>
+        <w:rPr>
+          <w:rFonts w:ascii="Times New Roman" w:hAnsi="Times New Roman" w:cs="Times New Roman"/>
+          <w:color w:val="262626"/>
+          <w:shd w:val="clear" w:color="auto" w:fill="FFFFFF"/>
+        </w:rPr>
+        <w:t xml:space="preserve"> in Taiwan, </w:t>
+      </w:r>
+      <w:bookmarkStart w:id="2" w:name="_Hlk161929612"/>
+      <w:proofErr w:type="spellStart"/>
+      <w:r>
+        <w:rPr>
+          <w:rFonts w:ascii="Times New Roman" w:hAnsi="Times New Roman" w:cs="Times New Roman"/>
+          <w:color w:val="262626"/>
+          <w:shd w:val="clear" w:color="auto" w:fill="FFFFFF"/>
+        </w:rPr>
+        <w:t>Global_Wafers</w:t>
+      </w:r>
+      <w:proofErr w:type="spellEnd"/>
+      <w:r>
+        <w:rPr>
+          <w:rFonts w:ascii="Times New Roman" w:hAnsi="Times New Roman" w:cs="Times New Roman"/>
+          <w:color w:val="262626"/>
+          <w:shd w:val="clear" w:color="auto" w:fill="FFFFFF"/>
+        </w:rPr>
+        <w:t xml:space="preserve"> </w:t>
+      </w:r>
+      <w:bookmarkEnd w:id="2"/>
+      <w:r>
+        <w:rPr>
+          <w:rFonts w:ascii="Times New Roman" w:hAnsi="Times New Roman" w:cs="Times New Roman"/>
+          <w:color w:val="262626"/>
+          <w:shd w:val="clear" w:color="auto" w:fill="FFFFFF"/>
+        </w:rPr>
+        <w:t>Co. Chairperson Doris Hsu (</w:t>
+      </w:r>
+      <w:r>
+        <w:rPr>
+          <w:rFonts w:ascii="Times New Roman" w:hAnsi="Times New Roman" w:cs="Times New Roman"/>
+          <w:color w:val="262626"/>
+          <w:shd w:val="clear" w:color="auto" w:fill="FFFFFF"/>
+        </w:rPr>
+        <w:t>徐秀蘭</w:t>
+      </w:r>
+      <w:r>
+        <w:rPr>
+          <w:rFonts w:ascii="Times New Roman" w:hAnsi="Times New Roman" w:cs="Times New Roman"/>
+          <w:color w:val="262626"/>
+          <w:shd w:val="clear" w:color="auto" w:fill="FFFFFF"/>
+        </w:rPr>
+        <w:t>) and the</w:t>
+      </w:r>
+      <w:r>
+        <w:rPr>
+          <w:rFonts w:ascii="Times New Roman" w:hAnsi="Times New Roman" w:cs="Times New Roman" w:hint="eastAsia"/>
+          <w:color w:val="262626"/>
+          <w:shd w:val="clear" w:color="auto" w:fill="FFFFFF"/>
+        </w:rPr>
+        <w:t xml:space="preserve"> </w:t>
+      </w:r>
+      <w:r>
+        <w:rPr>
+          <w:rFonts w:ascii="Times New Roman" w:hAnsi="Times New Roman" w:cs="Times New Roman"/>
+          <w:color w:val="262626"/>
+          <w:shd w:val="clear" w:color="auto" w:fill="FFFFFF"/>
+        </w:rPr>
+        <w:t>many other executives gathered were extremely tense but ready for whatever was about to happen</w:t>
+      </w:r>
+      <w:r>
+        <w:rPr>
+          <w:rFonts w:ascii="Times New Roman" w:hAnsi="Times New Roman" w:cs="Times New Roman" w:hint="eastAsia"/>
+          <w:color w:val="262626"/>
+          <w:shd w:val="clear" w:color="auto" w:fill="FFFFFF"/>
+        </w:rPr>
+        <w:t>.</w:t>
+      </w:r>
+    </w:p>
+    <w:p>
+      <w:pPr>
+        <w:pStyle w:val="ListParagraph"/>
+        <w:ind w:left="482"/>
+        <w:rPr>
+          <w:rFonts w:ascii="Times New Roman" w:hAnsi="Times New Roman" w:cs="Times New Roman"/>
+          <w:color w:val="262626"/>
+          <w:shd w:val="clear" w:color="auto" w:fill="FFFFFF"/>
+        </w:rPr>
+      </w:pPr>
+    </w:p>
+    <w:p>
+      <w:pPr>
+        <w:pStyle w:val="ListParagraph"/>
+        <w:ind w:left="482" w:firstLine="478"/>
+        <w:rPr>
+          <w:rFonts w:ascii="Times New Roman" w:hAnsi="Times New Roman" w:cs="Times New Roman"/>
+          <w:color w:val="00B0F0"/>
+          <w:shd w:val="clear" w:color="auto" w:fill="FFFFFF"/>
+        </w:rPr>
+      </w:pPr>
+      <w:r>
+        <w:rPr>
+          <w:rFonts w:ascii="Times New Roman" w:hAnsi="Times New Roman" w:cs="Times New Roman"/>
+          <w:b/>
+          <w:bCs/>
+          <w:color w:val="E97132" w:themeColor="accent2"/>
+          <w:shd w:val="clear" w:color="auto" w:fill="FFFFFF"/>
+        </w:rPr>
+        <w:t xml:space="preserve">The recent decision by </w:t>
+      </w:r>
+      <w:r>
+        <w:rPr>
+          <w:rFonts w:ascii="Times New Roman" w:hAnsi="Times New Roman" w:cs="Times New Roman"/>
+          <w:b/>
+          <w:bCs/>
+          <w:color w:val="E97132" w:themeColor="accent2"/>
+          <w:shd w:val="clear" w:color="auto" w:fill="FFFFFF"/>
+        </w:rPr>
+        <w:t>Global Wafers</w:t>
+      </w:r>
+      <w:r>
+        <w:rPr>
+          <w:rFonts w:ascii="Times New Roman" w:hAnsi="Times New Roman" w:cs="Times New Roman"/>
+          <w:color w:val="E97132" w:themeColor="accent2"/>
+          <w:shd w:val="clear" w:color="auto" w:fill="FFFFFF"/>
+        </w:rPr>
+        <w:t>,</w:t>
+      </w:r>
+      <w:r>
+        <w:rPr>
+          <w:rFonts w:ascii="Times New Roman" w:hAnsi="Times New Roman" w:cs="Times New Roman"/>
+          <w:color w:val="262626"/>
+          <w:shd w:val="clear" w:color="auto" w:fill="FFFFFF"/>
+        </w:rPr>
+        <w:t xml:space="preserve"> a major player in the semiconductor industry and parent company of Taiwan Semiconductor Manufacturing Company (TSMC), to establish a manufacturing facility in Germany marks a significant development in the global tech landscape. </w:t>
+      </w:r>
+      <w:r>
+        <w:rPr>
+          <w:rFonts w:ascii="Times New Roman" w:hAnsi="Times New Roman" w:cs="Times New Roman"/>
+          <w:color w:val="E97132" w:themeColor="accent2"/>
+          <w:shd w:val="clear" w:color="auto" w:fill="FFFFFF"/>
+        </w:rPr>
+        <w:t>This move prompts considerations about the factors</w:t>
+      </w:r>
+      <w:r>
+        <w:rPr>
+          <w:rFonts w:ascii="Times New Roman" w:hAnsi="Times New Roman" w:cs="Times New Roman"/>
+          <w:color w:val="262626"/>
+          <w:shd w:val="clear" w:color="auto" w:fill="FFFFFF"/>
+        </w:rPr>
+        <w:t xml:space="preserve"> </w:t>
+      </w:r>
+      <w:r>
+        <w:rPr>
+          <w:rFonts w:ascii="Times New Roman" w:hAnsi="Times New Roman" w:cs="Times New Roman"/>
+          <w:color w:val="00B0F0"/>
+          <w:shd w:val="clear" w:color="auto" w:fill="FFFFFF"/>
+        </w:rPr>
+        <w:t>driving such a decision and the potential implications</w:t>
+      </w:r>
+      <w:r>
+        <w:rPr>
+          <w:rFonts w:ascii="Times New Roman" w:hAnsi="Times New Roman" w:cs="Times New Roman"/>
+          <w:color w:val="262626"/>
+          <w:shd w:val="clear" w:color="auto" w:fill="FFFFFF"/>
+        </w:rPr>
+        <w:t xml:space="preserve"> for both the </w:t>
+      </w:r>
+      <w:r>
+        <w:rPr>
+          <w:rFonts w:ascii="Times New Roman" w:hAnsi="Times New Roman" w:cs="Times New Roman"/>
+          <w:color w:val="00B0F0"/>
+          <w:shd w:val="clear" w:color="auto" w:fill="FFFFFF"/>
+        </w:rPr>
+        <w:t xml:space="preserve">semiconductor industry </w:t>
+      </w:r>
+      <w:r>
+        <w:rPr>
+          <w:rFonts w:ascii="Times New Roman" w:hAnsi="Times New Roman" w:cs="Times New Roman"/>
+          <w:color w:val="262626"/>
+          <w:shd w:val="clear" w:color="auto" w:fill="FFFFFF"/>
+        </w:rPr>
+        <w:t xml:space="preserve">and the </w:t>
+      </w:r>
+      <w:r>
+        <w:rPr>
+          <w:rFonts w:ascii="Times New Roman" w:hAnsi="Times New Roman" w:cs="Times New Roman"/>
+          <w:color w:val="00B0F0"/>
+          <w:shd w:val="clear" w:color="auto" w:fill="FFFFFF"/>
+        </w:rPr>
+        <w:t>broader geopolitical context.</w:t>
+      </w:r>
+    </w:p>
+    <w:p>
+      <w:pPr>
+        <w:pStyle w:val="ListParagraph"/>
+        <w:ind w:left="482"/>
+        <w:rPr>
+          <w:rFonts w:ascii="Times New Roman" w:hAnsi="Times New Roman" w:cs="Times New Roman"/>
+          <w:color w:val="262626"/>
+          <w:shd w:val="clear" w:color="auto" w:fill="FFFFFF"/>
+        </w:rPr>
+      </w:pPr>
+    </w:p>
+    <w:p>
+      <w:pPr>
+        <w:pStyle w:val="ListParagraph"/>
+        <w:ind w:left="480" w:firstLine="480"/>
+        <w:rPr>
+          <w:rFonts w:ascii="Times New Roman" w:hAnsi="Times New Roman" w:cs="Times New Roman"/>
+          <w:color w:val="262626"/>
+          <w:shd w:val="clear" w:color="auto" w:fill="FFFFFF"/>
+        </w:rPr>
+      </w:pPr>
+      <w:r>
+        <w:rPr>
+          <w:rFonts w:ascii="Times New Roman" w:hAnsi="Times New Roman" w:cs="Times New Roman"/>
+          <w:color w:val="262626"/>
+          <w:shd w:val="clear" w:color="auto" w:fill="FFFFFF"/>
+        </w:rPr>
+        <w:t xml:space="preserve">At the forefront of this decision is the growing recognition of the importance of semiconductor manufacturing capabilities in ensuring national and economic security. </w:t>
+      </w:r>
+      <w:r>
+        <w:rPr>
+          <w:rFonts w:ascii="Times New Roman" w:hAnsi="Times New Roman" w:cs="Times New Roman"/>
+          <w:color w:val="E97132" w:themeColor="accent2"/>
+          <w:shd w:val="clear" w:color="auto" w:fill="FFFFFF"/>
+        </w:rPr>
+        <w:t>As the world becomes increasingly reliant on semiconductor chips for a wide range of applications,</w:t>
+      </w:r>
+      <w:r>
+        <w:rPr>
+          <w:rFonts w:ascii="Times New Roman" w:hAnsi="Times New Roman" w:cs="Times New Roman"/>
+          <w:color w:val="262626"/>
+          <w:shd w:val="clear" w:color="auto" w:fill="FFFFFF"/>
+        </w:rPr>
+        <w:t xml:space="preserve"> including </w:t>
+      </w:r>
+      <w:r>
+        <w:rPr>
+          <w:rFonts w:ascii="Times New Roman" w:hAnsi="Times New Roman" w:cs="Times New Roman"/>
+          <w:color w:val="0F9ED5" w:themeColor="accent4"/>
+          <w:shd w:val="clear" w:color="auto" w:fill="FFFFFF"/>
+        </w:rPr>
+        <w:t>smartphones,</w:t>
+      </w:r>
+      <w:r>
+        <w:rPr>
+          <w:rFonts w:ascii="Times New Roman" w:hAnsi="Times New Roman" w:cs="Times New Roman"/>
+          <w:color w:val="262626"/>
+          <w:shd w:val="clear" w:color="auto" w:fill="FFFFFF"/>
+        </w:rPr>
+        <w:t xml:space="preserve"> </w:t>
+      </w:r>
+      <w:r>
+        <w:rPr>
+          <w:rFonts w:ascii="Times New Roman" w:hAnsi="Times New Roman" w:cs="Times New Roman"/>
+          <w:color w:val="0F9ED5" w:themeColor="accent4"/>
+          <w:shd w:val="clear" w:color="auto" w:fill="FFFFFF"/>
+        </w:rPr>
+        <w:t>automobiles</w:t>
+      </w:r>
+      <w:r>
+        <w:rPr>
+          <w:rFonts w:ascii="Times New Roman" w:hAnsi="Times New Roman" w:cs="Times New Roman"/>
+          <w:color w:val="262626"/>
+          <w:shd w:val="clear" w:color="auto" w:fill="FFFFFF"/>
+        </w:rPr>
+        <w:t xml:space="preserve">, and </w:t>
+      </w:r>
+      <w:r>
+        <w:rPr>
+          <w:rFonts w:ascii="Times New Roman" w:hAnsi="Times New Roman" w:cs="Times New Roman"/>
+          <w:color w:val="0F9ED5" w:themeColor="accent4"/>
+          <w:shd w:val="clear" w:color="auto" w:fill="FFFFFF"/>
+        </w:rPr>
+        <w:t>critical infrastructure,</w:t>
+      </w:r>
+      <w:r>
+        <w:rPr>
+          <w:rFonts w:ascii="Times New Roman" w:hAnsi="Times New Roman" w:cs="Times New Roman"/>
+          <w:color w:val="262626"/>
+          <w:shd w:val="clear" w:color="auto" w:fill="FFFFFF"/>
+        </w:rPr>
+        <w:t xml:space="preserve"> countries are seeking to bolster their domestic semiconductor industries to reduce dependence on foreign suppliers and mitigate supply chain risks.</w:t>
       </w:r>
     </w:p>
     <w:p>
@@ -175,323 +1311,61 @@
         <w:pStyle w:val="ListParagraph"/>
         <w:ind w:left="480"/>
         <w:rPr>
-          <w:rFonts w:ascii="Times New Roman" w:hAnsi="Times New Roman" w:cs="Times New Roman" w:hint="eastAsia"/>
-          <w:color w:val="262626"/>
-          <w:shd w:val="clear" w:color="auto" w:fill="FFFFFF"/>
-        </w:rPr>
-      </w:pPr>
-      <w:r>
-        <w:rPr>
-          <w:rFonts w:ascii="Times New Roman" w:hAnsi="Times New Roman" w:cs="Times New Roman"/>
-          <w:color w:val="262626"/>
-          <w:shd w:val="clear" w:color="auto" w:fill="FFFFFF"/>
-        </w:rPr>
-        <w:t>Huawei Cloud is making good inroads into the South African market thanks to its security, compliance</w:t>
-      </w:r>
-      <w:r>
-        <w:rPr>
-          <w:rFonts w:ascii="Times New Roman" w:hAnsi="Times New Roman" w:cs="Times New Roman"/>
-          <w:color w:val="262626"/>
-          <w:shd w:val="clear" w:color="auto" w:fill="FFFFFF"/>
-        </w:rPr>
-        <w:t>,</w:t>
-      </w:r>
-      <w:r>
-        <w:rPr>
-          <w:rFonts w:ascii="Times New Roman" w:hAnsi="Times New Roman" w:cs="Times New Roman"/>
-          <w:color w:val="262626"/>
-          <w:shd w:val="clear" w:color="auto" w:fill="FFFFFF"/>
-        </w:rPr>
-        <w:t xml:space="preserve"> and in-country data </w:t>
-      </w:r>
-      <w:r>
-        <w:rPr>
-          <w:rFonts w:ascii="Times New Roman" w:hAnsi="Times New Roman" w:cs="Times New Roman"/>
-          <w:color w:val="262626"/>
-          <w:shd w:val="clear" w:color="auto" w:fill="FFFFFF"/>
-        </w:rPr>
-        <w:t>centers</w:t>
-      </w:r>
-      <w:r>
-        <w:rPr>
-          <w:rFonts w:ascii="Times New Roman" w:hAnsi="Times New Roman" w:cs="Times New Roman"/>
-          <w:color w:val="262626"/>
-          <w:shd w:val="clear" w:color="auto" w:fill="FFFFFF"/>
-        </w:rPr>
-        <w:t xml:space="preserve"> and support</w:t>
-      </w:r>
-      <w:r>
-        <w:rPr>
-          <w:rFonts w:ascii="Times New Roman" w:hAnsi="Times New Roman" w:cs="Times New Roman" w:hint="eastAsia"/>
-          <w:color w:val="262626"/>
-          <w:shd w:val="clear" w:color="auto" w:fill="FFFFFF"/>
-        </w:rPr>
-        <w:t>.</w:t>
-      </w:r>
-    </w:p>
-    <w:p>
-      <w:pPr>
-        <w:jc w:val="both"/>
-        <w:rPr>
-          <w:rFonts w:ascii="Times New Roman" w:hAnsi="Times New Roman" w:cs="Times New Roman" w:hint="eastAsia"/>
-          <w:color w:val="262626"/>
-          <w:shd w:val="clear" w:color="auto" w:fill="FFFFFF"/>
-        </w:rPr>
-      </w:pPr>
-      <w:r>
-        <w:rPr>
-          <w:rFonts w:ascii="Times New Roman" w:hAnsi="Times New Roman" w:cs="Times New Roman"/>
-          <w:color w:val="262626"/>
-          <w:shd w:val="clear" w:color="auto" w:fill="FFFFFF"/>
-        </w:rPr>
-        <w:t>Reflection on Huawei Data Privacy Concerns</w:t>
-      </w:r>
-    </w:p>
-    <w:p>
-      <w:pPr>
-        <w:jc w:val="both"/>
-        <w:rPr>
-          <w:rFonts w:ascii="Times New Roman" w:hAnsi="Times New Roman" w:cs="Times New Roman"/>
-          <w:color w:val="262626"/>
-          <w:shd w:val="clear" w:color="auto" w:fill="FFFFFF"/>
-        </w:rPr>
-      </w:pPr>
-      <w:r>
-        <w:rPr>
-          <w:rFonts w:ascii="Times New Roman" w:hAnsi="Times New Roman" w:cs="Times New Roman"/>
-          <w:color w:val="262626"/>
-          <w:shd w:val="clear" w:color="auto" w:fill="FFFFFF"/>
-        </w:rPr>
-        <w:t>In recent years, Huawei has been at the center of numerous controversies, with one of the most significant being concerns over data privacy. As the Chinese tech giant has expanded its global reach, questions about how it handles user data and its relationship with the Chinese government have become increasingly prevalent. Reflecting on this issue prompts considerations not only about Huawei's practices but also about broader implications for data privacy and international relations.</w:t>
-      </w:r>
-    </w:p>
-    <w:p>
-      <w:pPr>
-        <w:jc w:val="both"/>
-        <w:rPr>
-          <w:rFonts w:ascii="Times New Roman" w:hAnsi="Times New Roman" w:cs="Times New Roman"/>
-          <w:color w:val="262626"/>
-          <w:shd w:val="clear" w:color="auto" w:fill="FFFFFF"/>
-        </w:rPr>
-      </w:pPr>
-    </w:p>
-    <w:p>
-      <w:pPr>
-        <w:jc w:val="both"/>
-        <w:rPr>
-          <w:rFonts w:ascii="Times New Roman" w:hAnsi="Times New Roman" w:cs="Times New Roman"/>
-          <w:color w:val="262626"/>
-          <w:shd w:val="clear" w:color="auto" w:fill="FFFFFF"/>
-        </w:rPr>
-      </w:pPr>
-      <w:r>
-        <w:rPr>
-          <w:rFonts w:ascii="Times New Roman" w:hAnsi="Times New Roman" w:cs="Times New Roman"/>
-          <w:color w:val="262626"/>
-          <w:shd w:val="clear" w:color="auto" w:fill="FFFFFF"/>
-        </w:rPr>
-        <w:t>At the heart of the Huawei data privacy debate lies the concern that the company may be subject to Chinese government influence or control, raising questions about the security and privacy of user data. The fear is that Huawei could be compelled to provide sensitive information to Chinese authorities, either voluntarily or through legal mandates, posing risks to user privacy and national security in countries where Huawei operates.</w:t>
-      </w:r>
-    </w:p>
-    <w:p>
-      <w:pPr>
-        <w:jc w:val="both"/>
-        <w:rPr>
-          <w:rFonts w:ascii="Times New Roman" w:hAnsi="Times New Roman" w:cs="Times New Roman"/>
-          <w:color w:val="262626"/>
-          <w:shd w:val="clear" w:color="auto" w:fill="FFFFFF"/>
-        </w:rPr>
-      </w:pPr>
-    </w:p>
-    <w:p>
-      <w:pPr>
-        <w:jc w:val="both"/>
-        <w:rPr>
-          <w:rFonts w:ascii="Times New Roman" w:hAnsi="Times New Roman" w:cs="Times New Roman"/>
-          <w:color w:val="262626"/>
-          <w:shd w:val="clear" w:color="auto" w:fill="FFFFFF"/>
-        </w:rPr>
-      </w:pPr>
-      <w:r>
-        <w:rPr>
-          <w:rFonts w:ascii="Times New Roman" w:hAnsi="Times New Roman" w:cs="Times New Roman"/>
-          <w:color w:val="262626"/>
-          <w:shd w:val="clear" w:color="auto" w:fill="FFFFFF"/>
-        </w:rPr>
-        <w:t>This issue raises fundamental questions about the balance between national security interests and the principles of data privacy and user rights. Governments around the world are grappling with how to address these concerns while also benefiting from the technological advancements and economic opportunities that companies like Huawei offer. It underscores the need for robust regulatory frameworks and international cooperation to safeguard data privacy in an increasingly interconnected world.</w:t>
-      </w:r>
-    </w:p>
-    <w:p>
-      <w:pPr>
-        <w:jc w:val="both"/>
-        <w:rPr>
-          <w:rFonts w:ascii="Times New Roman" w:hAnsi="Times New Roman" w:cs="Times New Roman"/>
-          <w:color w:val="262626"/>
-          <w:shd w:val="clear" w:color="auto" w:fill="FFFFFF"/>
-        </w:rPr>
-      </w:pPr>
-    </w:p>
-    <w:p>
-      <w:pPr>
-        <w:jc w:val="both"/>
-        <w:rPr>
-          <w:rFonts w:ascii="Times New Roman" w:hAnsi="Times New Roman" w:cs="Times New Roman"/>
-          <w:color w:val="262626"/>
-          <w:shd w:val="clear" w:color="auto" w:fill="FFFFFF"/>
-        </w:rPr>
-      </w:pPr>
-      <w:r>
-        <w:rPr>
-          <w:rFonts w:ascii="Times New Roman" w:hAnsi="Times New Roman" w:cs="Times New Roman"/>
-          <w:color w:val="262626"/>
-          <w:shd w:val="clear" w:color="auto" w:fill="FFFFFF"/>
-        </w:rPr>
-        <w:t xml:space="preserve">From a personal perspective, the Huawei data privacy concerns serve as a reminder of the importance of being vigilant about the technologies and platforms we entrust with our data. As individuals, we must be aware of the potential risks and take steps to </w:t>
-      </w:r>
-      <w:r>
-        <w:rPr>
-          <w:rFonts w:ascii="Times New Roman" w:hAnsi="Times New Roman" w:cs="Times New Roman"/>
-          <w:color w:val="262626"/>
-          <w:shd w:val="clear" w:color="auto" w:fill="FFFFFF"/>
-        </w:rPr>
-        <w:lastRenderedPageBreak/>
-        <w:t>protect our privacy, whether through understanding privacy policies, using encryption tools, or advocating for stronger data protection laws.</w:t>
-      </w:r>
-    </w:p>
-    <w:p>
-      <w:pPr>
-        <w:jc w:val="both"/>
-        <w:rPr>
-          <w:rFonts w:ascii="Times New Roman" w:hAnsi="Times New Roman" w:cs="Times New Roman"/>
-          <w:color w:val="262626"/>
-          <w:shd w:val="clear" w:color="auto" w:fill="FFFFFF"/>
-        </w:rPr>
-      </w:pPr>
-    </w:p>
-    <w:p>
-      <w:pPr>
-        <w:jc w:val="both"/>
-        <w:rPr>
-          <w:rFonts w:ascii="Times New Roman" w:hAnsi="Times New Roman" w:cs="Times New Roman"/>
-          <w:color w:val="262626"/>
-          <w:shd w:val="clear" w:color="auto" w:fill="FFFFFF"/>
-        </w:rPr>
-      </w:pPr>
-      <w:r>
-        <w:rPr>
-          <w:rFonts w:ascii="Times New Roman" w:hAnsi="Times New Roman" w:cs="Times New Roman"/>
-          <w:color w:val="262626"/>
-          <w:shd w:val="clear" w:color="auto" w:fill="FFFFFF"/>
-        </w:rPr>
-        <w:t>Moreover, this issue highlights the complexities of navigating the global landscape of technology and geopolitics. As consumers and citizens, we are increasingly confronted with choices that have implications beyond our immediate interactions, prompting us to consider not only the features and benefits of products and services but also their broader societal and political ramifications.</w:t>
-      </w:r>
-    </w:p>
-    <w:p>
-      <w:pPr>
-        <w:jc w:val="both"/>
-        <w:rPr>
-          <w:rFonts w:ascii="Times New Roman" w:hAnsi="Times New Roman" w:cs="Times New Roman"/>
-          <w:color w:val="262626"/>
-          <w:shd w:val="clear" w:color="auto" w:fill="FFFFFF"/>
-        </w:rPr>
-      </w:pPr>
-    </w:p>
-    <w:p>
-      <w:pPr>
-        <w:jc w:val="both"/>
-        <w:rPr>
-          <w:rFonts w:ascii="Times New Roman" w:hAnsi="Times New Roman" w:cs="Times New Roman" w:hint="eastAsia"/>
-          <w:color w:val="262626"/>
-          <w:shd w:val="clear" w:color="auto" w:fill="FFFFFF"/>
-        </w:rPr>
-      </w:pPr>
-      <w:r>
-        <w:rPr>
-          <w:rFonts w:ascii="Times New Roman" w:hAnsi="Times New Roman" w:cs="Times New Roman"/>
-          <w:color w:val="262626"/>
-          <w:shd w:val="clear" w:color="auto" w:fill="FFFFFF"/>
-        </w:rPr>
-        <w:t>In conclusion, the Huawei data privacy concerns represent a multifaceted issue with far-reaching implications for individuals, governments, and the global tech industry. Addressing these concerns requires a balanced approach that upholds both privacy rights and national security interests while fostering transparency, accountability, and cooperation among stakeholders. As we navigate the complexities of the digital age, it is imperative that we remain vigilant and engaged in shaping policies and practices that promote a safe and secure digital environment for all.</w:t>
-      </w:r>
+          <w:rFonts w:ascii="Times New Roman" w:hAnsi="Times New Roman" w:cs="Times New Roman"/>
+          <w:color w:val="262626"/>
+          <w:shd w:val="clear" w:color="auto" w:fill="FFFFFF"/>
+        </w:rPr>
+      </w:pPr>
     </w:p>
     <w:p>
       <w:pPr>
         <w:pStyle w:val="ListParagraph"/>
-        <w:numPr>
-          <w:ilvl w:val="0"/>
-          <w:numId w:val="1"/>
-        </w:numPr>
-        <w:rPr>
-          <w:rFonts w:ascii="Times New Roman" w:eastAsia="標楷體" w:hAnsi="Times New Roman"/>
-          <w:sz w:val="36"/>
-          <w:szCs w:val="36"/>
-        </w:rPr>
-      </w:pPr>
-      <w:proofErr w:type="spellStart"/>
-      <w:r>
-        <w:rPr>
-          <w:rFonts w:ascii="Times New Roman" w:eastAsia="標楷體" w:hAnsi="Times New Roman"/>
-          <w:sz w:val="36"/>
-          <w:szCs w:val="36"/>
-        </w:rPr>
-        <w:t>GlobalWafers</w:t>
-      </w:r>
-      <w:proofErr w:type="spellEnd"/>
-      <w:r>
-        <w:rPr>
-          <w:rFonts w:ascii="Times New Roman" w:eastAsia="標楷體" w:hAnsi="Times New Roman"/>
-          <w:sz w:val="36"/>
-          <w:szCs w:val="36"/>
-        </w:rPr>
-        <w:t xml:space="preserve"> </w:t>
-      </w:r>
-      <w:r>
-        <w:rPr>
-          <w:rFonts w:ascii="Times New Roman" w:eastAsia="標楷體" w:hAnsi="Times New Roman" w:hint="eastAsia"/>
-          <w:sz w:val="36"/>
-          <w:szCs w:val="36"/>
-        </w:rPr>
-        <w:t>(</w:t>
-      </w:r>
-      <w:r>
-        <w:rPr>
-          <w:rFonts w:ascii="Times New Roman" w:eastAsia="標楷體" w:hAnsi="Times New Roman" w:hint="eastAsia"/>
-          <w:sz w:val="36"/>
-          <w:szCs w:val="36"/>
-        </w:rPr>
-        <w:t>TSMC</w:t>
-      </w:r>
-      <w:r>
-        <w:rPr>
-          <w:rFonts w:ascii="Times New Roman" w:eastAsia="標楷體" w:hAnsi="Times New Roman" w:hint="eastAsia"/>
-          <w:sz w:val="36"/>
-          <w:szCs w:val="36"/>
-        </w:rPr>
-        <w:t>)</w:t>
-      </w:r>
-      <w:r>
-        <w:rPr>
-          <w:rFonts w:ascii="Times New Roman" w:eastAsia="標楷體" w:hAnsi="Times New Roman" w:hint="eastAsia"/>
-          <w:sz w:val="36"/>
-          <w:szCs w:val="36"/>
-        </w:rPr>
-        <w:t xml:space="preserve"> Move to </w:t>
-      </w:r>
-      <w:r>
-        <w:rPr>
-          <w:rFonts w:ascii="Times New Roman" w:eastAsia="標楷體" w:hAnsi="Times New Roman"/>
-          <w:sz w:val="36"/>
-          <w:szCs w:val="36"/>
-        </w:rPr>
-        <w:t>Germany</w:t>
-      </w:r>
-      <w:r>
-        <w:rPr>
-          <w:rFonts w:ascii="Times New Roman" w:eastAsia="標楷體" w:hAnsi="Times New Roman" w:hint="eastAsia"/>
-          <w:sz w:val="36"/>
-          <w:szCs w:val="36"/>
-        </w:rPr>
-        <w:t xml:space="preserve"> </w:t>
+        <w:ind w:left="482" w:firstLine="482"/>
+        <w:rPr>
+          <w:rFonts w:ascii="Times New Roman" w:hAnsi="Times New Roman" w:cs="Times New Roman"/>
+          <w:color w:val="262626"/>
+          <w:shd w:val="clear" w:color="auto" w:fill="FFFFFF"/>
+        </w:rPr>
+      </w:pPr>
+      <w:r>
+        <w:rPr>
+          <w:rFonts w:ascii="Times New Roman" w:hAnsi="Times New Roman" w:cs="Times New Roman"/>
+          <w:color w:val="262626"/>
+          <w:shd w:val="clear" w:color="auto" w:fill="FFFFFF"/>
+        </w:rPr>
+        <w:t xml:space="preserve">Germany's appeal as a destination for </w:t>
+      </w:r>
+      <w:r>
+        <w:rPr>
+          <w:rFonts w:ascii="Times New Roman" w:hAnsi="Times New Roman" w:cs="Times New Roman"/>
+          <w:color w:val="262626"/>
+          <w:shd w:val="clear" w:color="auto" w:fill="FFFFFF"/>
+        </w:rPr>
+        <w:t>Global Wafers</w:t>
+      </w:r>
+      <w:r>
+        <w:rPr>
+          <w:rFonts w:ascii="Times New Roman" w:hAnsi="Times New Roman" w:cs="Times New Roman"/>
+          <w:color w:val="262626"/>
+          <w:shd w:val="clear" w:color="auto" w:fill="FFFFFF"/>
+        </w:rPr>
+        <w:t xml:space="preserve">' new manufacturing facility reflects the country's strengths in engineering, innovation, and skilled workforce. By establishing a presence in Germany, </w:t>
+      </w:r>
+      <w:r>
+        <w:rPr>
+          <w:rFonts w:ascii="Times New Roman" w:hAnsi="Times New Roman" w:cs="Times New Roman"/>
+          <w:color w:val="00B0F0"/>
+          <w:shd w:val="clear" w:color="auto" w:fill="FFFFFF"/>
+        </w:rPr>
+        <w:t>Global Wafers</w:t>
+      </w:r>
+      <w:r>
+        <w:rPr>
+          <w:rFonts w:ascii="Times New Roman" w:hAnsi="Times New Roman" w:cs="Times New Roman"/>
+          <w:color w:val="00B0F0"/>
+          <w:shd w:val="clear" w:color="auto" w:fill="FFFFFF"/>
+        </w:rPr>
+        <w:t xml:space="preserve"> aims to leverage these strengths to expand its production capacity and meet the growing demand for semiconductor chips in Europe and beyond.</w:t>
       </w:r>
     </w:p>
     <w:p>
@@ -499,28 +1373,70 @@
         <w:pStyle w:val="ListParagraph"/>
         <w:ind w:left="480"/>
         <w:rPr>
+          <w:rFonts w:ascii="Times New Roman" w:hAnsi="Times New Roman" w:cs="Times New Roman"/>
+          <w:color w:val="262626"/>
+          <w:shd w:val="clear" w:color="auto" w:fill="FFFFFF"/>
+        </w:rPr>
+      </w:pPr>
+    </w:p>
+    <w:p>
+      <w:pPr>
+        <w:pStyle w:val="ListParagraph"/>
+        <w:ind w:left="482" w:firstLineChars="200" w:firstLine="480"/>
+        <w:rPr>
+          <w:rFonts w:ascii="Times New Roman" w:hAnsi="Times New Roman" w:cs="Times New Roman"/>
+          <w:color w:val="262626"/>
+          <w:shd w:val="clear" w:color="auto" w:fill="FFFFFF"/>
+        </w:rPr>
+      </w:pPr>
+      <w:r>
+        <w:rPr>
+          <w:rFonts w:ascii="Times New Roman" w:hAnsi="Times New Roman" w:cs="Times New Roman"/>
+          <w:color w:val="262626"/>
+          <w:shd w:val="clear" w:color="auto" w:fill="FFFFFF"/>
+        </w:rPr>
+        <w:t xml:space="preserve">From a broader </w:t>
+      </w:r>
+      <w:proofErr w:type="spellStart"/>
+      <w:r>
+        <w:rPr>
+          <w:rFonts w:ascii="Times New Roman" w:hAnsi="Times New Roman" w:cs="Times New Roman"/>
+          <w:color w:val="262626"/>
+          <w:kern w:val="0"/>
+          <w:shd w:val="clear" w:color="auto" w:fill="FFFFFF"/>
+          <w14:ligatures w14:val="none"/>
+        </w:rPr>
+        <w:t>Global_Wafer's</w:t>
+      </w:r>
+      <w:proofErr w:type="spellEnd"/>
+      <w:r>
+        <w:rPr>
           <w:rFonts w:ascii="Times New Roman" w:hAnsi="Times New Roman" w:cs="Times New Roman" w:hint="eastAsia"/>
           <w:color w:val="262626"/>
-          <w:shd w:val="clear" w:color="auto" w:fill="FFFFFF"/>
-        </w:rPr>
-      </w:pPr>
-      <w:r>
-        <w:rPr>
-          <w:rFonts w:ascii="Times New Roman" w:hAnsi="Times New Roman" w:cs="Times New Roman"/>
-          <w:color w:val="262626"/>
-          <w:shd w:val="clear" w:color="auto" w:fill="FFFFFF"/>
-        </w:rPr>
-        <w:t xml:space="preserve">It was Feb. 1, 2022, the first day of the Year of the Tiger. The clock was winding down, and when it hit 6:59 a.m. in Taiwan, </w:t>
-      </w:r>
-      <w:bookmarkStart w:id="0" w:name="_Hlk161929612"/>
+          <w:kern w:val="0"/>
+          <w:shd w:val="clear" w:color="auto" w:fill="FFFFFF"/>
+          <w14:ligatures w14:val="none"/>
+        </w:rPr>
+        <w:t xml:space="preserve"> </w:t>
+      </w:r>
+      <w:r>
+        <w:rPr>
+          <w:rFonts w:ascii="Times New Roman" w:hAnsi="Times New Roman" w:cs="Times New Roman"/>
+          <w:color w:val="262626"/>
+          <w:shd w:val="clear" w:color="auto" w:fill="FFFFFF"/>
+        </w:rPr>
+        <w:t xml:space="preserve">perspective, the </w:t>
+      </w:r>
       <w:proofErr w:type="spellStart"/>
       <w:r>
         <w:rPr>
           <w:rFonts w:ascii="Times New Roman" w:hAnsi="Times New Roman" w:cs="Times New Roman"/>
           <w:color w:val="262626"/>
-          <w:shd w:val="clear" w:color="auto" w:fill="FFFFFF"/>
-        </w:rPr>
-        <w:t>GlobalWafers</w:t>
+          <w:kern w:val="0"/>
+          <w:shd w:val="clear" w:color="auto" w:fill="FFFFFF"/>
+          <w14:ligatures w14:val="none"/>
+        </w:rPr>
+        <w:t>Global_Wafer's</w:t>
       </w:r>
       <w:proofErr w:type="spellEnd"/>
       <w:r>
@@ -529,64 +1445,176 @@
           <w:color w:val="262626"/>
           <w:shd w:val="clear" w:color="auto" w:fill="FFFFFF"/>
         </w:rPr>
-        <w:t xml:space="preserve"> </w:t>
-      </w:r>
-      <w:bookmarkEnd w:id="0"/>
-      <w:r>
-        <w:rPr>
-          <w:rFonts w:ascii="Times New Roman" w:hAnsi="Times New Roman" w:cs="Times New Roman"/>
-          <w:color w:val="262626"/>
-          <w:shd w:val="clear" w:color="auto" w:fill="FFFFFF"/>
-        </w:rPr>
-        <w:t>Co. Chairperson Doris Hsu (</w:t>
-      </w:r>
-      <w:r>
-        <w:rPr>
-          <w:rFonts w:ascii="Times New Roman" w:hAnsi="Times New Roman" w:cs="Times New Roman"/>
-          <w:color w:val="262626"/>
-          <w:shd w:val="clear" w:color="auto" w:fill="FFFFFF"/>
-        </w:rPr>
-        <w:t>徐秀蘭</w:t>
-      </w:r>
-      <w:r>
-        <w:rPr>
-          <w:rFonts w:ascii="Times New Roman" w:hAnsi="Times New Roman" w:cs="Times New Roman"/>
-          <w:color w:val="262626"/>
-          <w:shd w:val="clear" w:color="auto" w:fill="FFFFFF"/>
-        </w:rPr>
-        <w:t>) and the</w:t>
-      </w:r>
-      <w:r>
-        <w:rPr>
-          <w:rFonts w:ascii="Times New Roman" w:hAnsi="Times New Roman" w:cs="Times New Roman" w:hint="eastAsia"/>
-          <w:color w:val="262626"/>
-          <w:shd w:val="clear" w:color="auto" w:fill="FFFFFF"/>
-        </w:rPr>
-        <w:t xml:space="preserve"> </w:t>
-      </w:r>
-      <w:r>
-        <w:rPr>
-          <w:rFonts w:ascii="Times New Roman" w:hAnsi="Times New Roman" w:cs="Times New Roman"/>
-          <w:color w:val="262626"/>
-          <w:shd w:val="clear" w:color="auto" w:fill="FFFFFF"/>
-        </w:rPr>
-        <w:t>many other executives gathered were extremely tense but ready for whatever was about to happen</w:t>
-      </w:r>
-      <w:r>
-        <w:rPr>
-          <w:rFonts w:ascii="Times New Roman" w:hAnsi="Times New Roman" w:cs="Times New Roman" w:hint="eastAsia"/>
-          <w:color w:val="262626"/>
-          <w:shd w:val="clear" w:color="auto" w:fill="FFFFFF"/>
-        </w:rPr>
-        <w:t>.</w:t>
-      </w:r>
-      <w:r>
-        <w:rPr>
-          <w:rFonts w:ascii="Times New Roman" w:hAnsi="Times New Roman" w:cs="Times New Roman"/>
-          <w:color w:val="262626"/>
-          <w:shd w:val="clear" w:color="auto" w:fill="FFFFFF"/>
-        </w:rPr>
-        <w:br/>
+        <w:t xml:space="preserve"> move to Germany underscores the shifting dynamics of global tech competition and the rise of new players in the semiconductor industry. Traditionally dominated by </w:t>
+      </w:r>
+      <w:r>
+        <w:rPr>
+          <w:rFonts w:ascii="Times New Roman" w:hAnsi="Times New Roman" w:cs="Times New Roman"/>
+          <w:color w:val="262626"/>
+          <w:shd w:val="clear" w:color="auto" w:fill="FFFFFF"/>
+        </w:rPr>
+        <w:lastRenderedPageBreak/>
+        <w:t>companies in East Asia, particularly Taiwan, South Korea, and China, the semiconductor market is witnessing the emergence of new manufacturing hubs and players in Europe and North America.</w:t>
+      </w:r>
+    </w:p>
+    <w:p>
+      <w:pPr>
+        <w:pStyle w:val="ListParagraph"/>
+        <w:ind w:left="482" w:firstLineChars="200" w:firstLine="480"/>
+        <w:rPr>
+          <w:rFonts w:ascii="Times New Roman" w:hAnsi="Times New Roman" w:cs="Times New Roman"/>
+          <w:color w:val="262626"/>
+          <w:shd w:val="clear" w:color="auto" w:fill="FFFFFF"/>
+        </w:rPr>
+      </w:pPr>
+    </w:p>
+    <w:p>
+      <w:pPr>
+        <w:pStyle w:val="ListParagraph"/>
+        <w:ind w:left="482" w:firstLineChars="200" w:firstLine="480"/>
+        <w:rPr>
+          <w:rFonts w:ascii="Times New Roman" w:hAnsi="Times New Roman" w:cs="Times New Roman"/>
+          <w:color w:val="262626"/>
+          <w:shd w:val="clear" w:color="auto" w:fill="FFFFFF"/>
+        </w:rPr>
+      </w:pPr>
+      <w:r>
+        <w:rPr>
+          <w:rFonts w:ascii="Times New Roman" w:hAnsi="Times New Roman" w:cs="Times New Roman"/>
+          <w:color w:val="262626"/>
+          <w:shd w:val="clear" w:color="auto" w:fill="FFFFFF"/>
+        </w:rPr>
+        <w:t xml:space="preserve">From a personal standpoint, the </w:t>
+      </w:r>
+      <w:proofErr w:type="spellStart"/>
+      <w:r>
+        <w:rPr>
+          <w:rFonts w:ascii="Times New Roman" w:hAnsi="Times New Roman" w:cs="Times New Roman"/>
+          <w:color w:val="262626"/>
+          <w:shd w:val="clear" w:color="auto" w:fill="FFFFFF"/>
+        </w:rPr>
+        <w:t>Global_Wafers</w:t>
+      </w:r>
+      <w:proofErr w:type="spellEnd"/>
+      <w:r>
+        <w:rPr>
+          <w:rFonts w:ascii="Times New Roman" w:hAnsi="Times New Roman" w:cs="Times New Roman"/>
+          <w:color w:val="262626"/>
+          <w:shd w:val="clear" w:color="auto" w:fill="FFFFFF"/>
+        </w:rPr>
+        <w:t xml:space="preserve"> move to </w:t>
+      </w:r>
+      <w:r>
+        <w:rPr>
+          <w:rFonts w:ascii="Times New Roman" w:hAnsi="Times New Roman" w:cs="Times New Roman"/>
+          <w:color w:val="E97132" w:themeColor="accent2"/>
+          <w:shd w:val="clear" w:color="auto" w:fill="FFFFFF"/>
+        </w:rPr>
+        <w:t>Germany prompts reflection on the interconnectedness of global economies and the role of technology</w:t>
+      </w:r>
+      <w:r>
+        <w:rPr>
+          <w:rFonts w:ascii="Times New Roman" w:hAnsi="Times New Roman" w:cs="Times New Roman"/>
+          <w:color w:val="262626"/>
+          <w:shd w:val="clear" w:color="auto" w:fill="FFFFFF"/>
+        </w:rPr>
+        <w:t xml:space="preserve"> in </w:t>
+      </w:r>
+      <w:r>
+        <w:rPr>
+          <w:rFonts w:ascii="Times New Roman" w:hAnsi="Times New Roman" w:cs="Times New Roman"/>
+          <w:color w:val="00B0F0"/>
+          <w:shd w:val="clear" w:color="auto" w:fill="FFFFFF"/>
+        </w:rPr>
+        <w:t xml:space="preserve">driving innovation </w:t>
+      </w:r>
+      <w:r>
+        <w:rPr>
+          <w:rFonts w:ascii="Times New Roman" w:hAnsi="Times New Roman" w:cs="Times New Roman"/>
+          <w:color w:val="262626"/>
+          <w:shd w:val="clear" w:color="auto" w:fill="FFFFFF"/>
+        </w:rPr>
+        <w:t xml:space="preserve">and </w:t>
+      </w:r>
+      <w:r>
+        <w:rPr>
+          <w:rFonts w:ascii="Times New Roman" w:hAnsi="Times New Roman" w:cs="Times New Roman"/>
+          <w:color w:val="00B0F0"/>
+          <w:shd w:val="clear" w:color="auto" w:fill="FFFFFF"/>
+        </w:rPr>
+        <w:t>economic growth</w:t>
+      </w:r>
+      <w:r>
+        <w:rPr>
+          <w:rFonts w:ascii="Times New Roman" w:hAnsi="Times New Roman" w:cs="Times New Roman"/>
+          <w:color w:val="262626"/>
+          <w:shd w:val="clear" w:color="auto" w:fill="FFFFFF"/>
+        </w:rPr>
+        <w:t xml:space="preserve">. As consumers and citizens, </w:t>
+      </w:r>
+      <w:r>
+        <w:rPr>
+          <w:rFonts w:ascii="Times New Roman" w:hAnsi="Times New Roman" w:cs="Times New Roman"/>
+          <w:color w:val="E97132" w:themeColor="accent2"/>
+          <w:shd w:val="clear" w:color="auto" w:fill="FFFFFF"/>
+        </w:rPr>
+        <w:t>we rely on semiconductor chips in virtually every aspect of our daily lives</w:t>
+      </w:r>
+      <w:r>
+        <w:rPr>
+          <w:rFonts w:ascii="Times New Roman" w:hAnsi="Times New Roman" w:cs="Times New Roman"/>
+          <w:color w:val="262626"/>
+          <w:shd w:val="clear" w:color="auto" w:fill="FFFFFF"/>
+        </w:rPr>
+        <w:t>, from</w:t>
+      </w:r>
+      <w:r>
+        <w:rPr>
+          <w:rFonts w:ascii="Times New Roman" w:hAnsi="Times New Roman" w:cs="Times New Roman"/>
+          <w:color w:val="0F9ED5" w:themeColor="accent4"/>
+          <w:shd w:val="clear" w:color="auto" w:fill="FFFFFF"/>
+        </w:rPr>
+        <w:t xml:space="preserve"> communication</w:t>
+      </w:r>
+      <w:r>
+        <w:rPr>
+          <w:rFonts w:ascii="Times New Roman" w:hAnsi="Times New Roman" w:cs="Times New Roman"/>
+          <w:color w:val="262626"/>
+          <w:shd w:val="clear" w:color="auto" w:fill="FFFFFF"/>
+        </w:rPr>
+        <w:t xml:space="preserve"> and </w:t>
+      </w:r>
+      <w:r>
+        <w:rPr>
+          <w:rFonts w:ascii="Times New Roman" w:hAnsi="Times New Roman" w:cs="Times New Roman"/>
+          <w:color w:val="0F9ED5" w:themeColor="accent4"/>
+          <w:shd w:val="clear" w:color="auto" w:fill="FFFFFF"/>
+        </w:rPr>
+        <w:t>transportation to healthcare</w:t>
+      </w:r>
+      <w:r>
+        <w:rPr>
+          <w:rFonts w:ascii="Times New Roman" w:hAnsi="Times New Roman" w:cs="Times New Roman"/>
+          <w:color w:val="262626"/>
+          <w:shd w:val="clear" w:color="auto" w:fill="FFFFFF"/>
+        </w:rPr>
+        <w:t xml:space="preserve"> and </w:t>
+      </w:r>
+      <w:r>
+        <w:rPr>
+          <w:rFonts w:ascii="Times New Roman" w:hAnsi="Times New Roman" w:cs="Times New Roman"/>
+          <w:color w:val="0F9ED5" w:themeColor="accent4"/>
+          <w:shd w:val="clear" w:color="auto" w:fill="FFFFFF"/>
+        </w:rPr>
+        <w:t>entertainment. Understanding</w:t>
+      </w:r>
+      <w:r>
+        <w:rPr>
+          <w:rFonts w:ascii="Times New Roman" w:hAnsi="Times New Roman" w:cs="Times New Roman"/>
+          <w:color w:val="262626"/>
+          <w:shd w:val="clear" w:color="auto" w:fill="FFFFFF"/>
+        </w:rPr>
+        <w:t xml:space="preserve"> the factors influencing semiconductor manufacturing decisions helps us appreciate the complexities of the global tech ecosystem and the implications for future technological advancements and societal progress.</w:t>
       </w:r>
     </w:p>
     <w:p>
@@ -599,583 +1627,97 @@
           <w:shd w:val="clear" w:color="auto" w:fill="FFFFFF"/>
         </w:rPr>
       </w:pPr>
-      <w:r>
-        <w:rPr>
-          <w:rFonts w:ascii="Times New Roman" w:hAnsi="Times New Roman" w:cs="Times New Roman"/>
-          <w:color w:val="262626"/>
-          <w:shd w:val="clear" w:color="auto" w:fill="FFFFFF"/>
-        </w:rPr>
-        <w:t xml:space="preserve">Reflecting on </w:t>
+    </w:p>
+    <w:p>
+      <w:pPr>
+        <w:pStyle w:val="ListParagraph"/>
+        <w:ind w:left="482" w:firstLineChars="200" w:firstLine="480"/>
+        <w:rPr>
+          <w:rFonts w:ascii="Times New Roman" w:hAnsi="Times New Roman" w:cs="Times New Roman"/>
+          <w:color w:val="262626"/>
+          <w:shd w:val="clear" w:color="auto" w:fill="FFFFFF"/>
+        </w:rPr>
+      </w:pPr>
+      <w:r>
+        <w:rPr>
+          <w:rFonts w:ascii="Times New Roman" w:hAnsi="Times New Roman" w:cs="Times New Roman"/>
+          <w:color w:val="262626"/>
+          <w:shd w:val="clear" w:color="auto" w:fill="FFFFFF"/>
+        </w:rPr>
+        <w:t xml:space="preserve">In conclusion, </w:t>
       </w:r>
       <w:proofErr w:type="spellStart"/>
       <w:r>
         <w:rPr>
           <w:rFonts w:ascii="Times New Roman" w:hAnsi="Times New Roman" w:cs="Times New Roman"/>
-          <w:color w:val="262626"/>
-          <w:shd w:val="clear" w:color="auto" w:fill="FFFFFF"/>
-        </w:rPr>
-        <w:t>GlobalWafers</w:t>
+          <w:color w:val="0F9ED5" w:themeColor="accent4"/>
+          <w:shd w:val="clear" w:color="auto" w:fill="FFFFFF"/>
+        </w:rPr>
+        <w:t>Global_Wafers</w:t>
       </w:r>
       <w:proofErr w:type="spellEnd"/>
       <w:r>
         <w:rPr>
           <w:rFonts w:ascii="Times New Roman" w:hAnsi="Times New Roman" w:cs="Times New Roman"/>
-          <w:color w:val="262626"/>
-          <w:shd w:val="clear" w:color="auto" w:fill="FFFFFF"/>
-        </w:rPr>
-        <w:t xml:space="preserve"> (TSMC) Move to Germany</w:t>
-      </w:r>
-    </w:p>
-    <w:p>
-      <w:pPr>
-        <w:pStyle w:val="ListParagraph"/>
-        <w:ind w:left="480"/>
-        <w:rPr>
-          <w:rFonts w:ascii="Times New Roman" w:hAnsi="Times New Roman" w:cs="Times New Roman"/>
-          <w:color w:val="262626"/>
-          <w:shd w:val="clear" w:color="auto" w:fill="FFFFFF"/>
-        </w:rPr>
-      </w:pPr>
-    </w:p>
-    <w:p>
-      <w:pPr>
-        <w:pStyle w:val="ListParagraph"/>
-        <w:ind w:left="480"/>
-        <w:rPr>
-          <w:rFonts w:ascii="Times New Roman" w:hAnsi="Times New Roman" w:cs="Times New Roman"/>
-          <w:color w:val="262626"/>
-          <w:shd w:val="clear" w:color="auto" w:fill="FFFFFF"/>
-        </w:rPr>
-      </w:pPr>
-      <w:r>
-        <w:rPr>
-          <w:rFonts w:ascii="Times New Roman" w:hAnsi="Times New Roman" w:cs="Times New Roman"/>
-          <w:color w:val="262626"/>
-          <w:shd w:val="clear" w:color="auto" w:fill="FFFFFF"/>
-        </w:rPr>
-        <w:t xml:space="preserve">The recent decision by </w:t>
-      </w:r>
-      <w:proofErr w:type="spellStart"/>
-      <w:r>
-        <w:rPr>
-          <w:rFonts w:ascii="Times New Roman" w:hAnsi="Times New Roman" w:cs="Times New Roman"/>
-          <w:color w:val="262626"/>
-          <w:shd w:val="clear" w:color="auto" w:fill="FFFFFF"/>
-        </w:rPr>
-        <w:t>GlobalWafers</w:t>
-      </w:r>
-      <w:proofErr w:type="spellEnd"/>
-      <w:r>
-        <w:rPr>
-          <w:rFonts w:ascii="Times New Roman" w:hAnsi="Times New Roman" w:cs="Times New Roman"/>
-          <w:color w:val="262626"/>
-          <w:shd w:val="clear" w:color="auto" w:fill="FFFFFF"/>
-        </w:rPr>
-        <w:t xml:space="preserve">, a major player in the semiconductor industry and parent company of Taiwan Semiconductor Manufacturing Company (TSMC), to establish a manufacturing facility in Germany marks a significant development in the global tech landscape. This </w:t>
-      </w:r>
-      <w:proofErr w:type="gramStart"/>
-      <w:r>
-        <w:rPr>
-          <w:rFonts w:ascii="Times New Roman" w:hAnsi="Times New Roman" w:cs="Times New Roman"/>
-          <w:color w:val="262626"/>
-          <w:shd w:val="clear" w:color="auto" w:fill="FFFFFF"/>
-        </w:rPr>
-        <w:t>move</w:t>
-      </w:r>
-      <w:proofErr w:type="gramEnd"/>
-      <w:r>
-        <w:rPr>
-          <w:rFonts w:ascii="Times New Roman" w:hAnsi="Times New Roman" w:cs="Times New Roman"/>
-          <w:color w:val="262626"/>
-          <w:shd w:val="clear" w:color="auto" w:fill="FFFFFF"/>
-        </w:rPr>
-        <w:t xml:space="preserve"> prompts considerations about the factors driving such a decision and the potential implications for both </w:t>
-      </w:r>
-      <w:r>
-        <w:rPr>
-          <w:rFonts w:ascii="Times New Roman" w:hAnsi="Times New Roman" w:cs="Times New Roman"/>
-          <w:color w:val="262626"/>
-          <w:shd w:val="clear" w:color="auto" w:fill="FFFFFF"/>
-        </w:rPr>
-        <w:lastRenderedPageBreak/>
-        <w:t>the semiconductor industry and the broader geopolitical context.</w:t>
-      </w:r>
-    </w:p>
-    <w:p>
-      <w:pPr>
-        <w:pStyle w:val="ListParagraph"/>
-        <w:ind w:left="480"/>
-        <w:rPr>
-          <w:rFonts w:ascii="Times New Roman" w:hAnsi="Times New Roman" w:cs="Times New Roman"/>
-          <w:color w:val="262626"/>
-          <w:shd w:val="clear" w:color="auto" w:fill="FFFFFF"/>
-        </w:rPr>
-      </w:pPr>
-    </w:p>
-    <w:p>
-      <w:pPr>
-        <w:pStyle w:val="ListParagraph"/>
-        <w:ind w:left="480"/>
-        <w:rPr>
-          <w:rFonts w:ascii="Times New Roman" w:hAnsi="Times New Roman" w:cs="Times New Roman"/>
-          <w:color w:val="262626"/>
-          <w:shd w:val="clear" w:color="auto" w:fill="FFFFFF"/>
-        </w:rPr>
-      </w:pPr>
-      <w:r>
-        <w:rPr>
-          <w:rFonts w:ascii="Times New Roman" w:hAnsi="Times New Roman" w:cs="Times New Roman"/>
-          <w:color w:val="262626"/>
-          <w:shd w:val="clear" w:color="auto" w:fill="FFFFFF"/>
-        </w:rPr>
-        <w:t>At the forefront of this decision is the growing recognition of the importance of semiconductor manufacturing capabilities in ensuring national and economic security. As the world becomes increasingly reliant on semiconductor chips for a wide range of applications, including smartphones, automobiles, and critical infrastructure, countries are seeking to bolster their domestic semiconductor industries to reduce dependence on foreign suppliers and mitigate supply chain risks.</w:t>
-      </w:r>
-    </w:p>
-    <w:p>
-      <w:pPr>
-        <w:pStyle w:val="ListParagraph"/>
-        <w:ind w:left="480"/>
-        <w:rPr>
-          <w:rFonts w:ascii="Times New Roman" w:hAnsi="Times New Roman" w:cs="Times New Roman"/>
-          <w:color w:val="262626"/>
-          <w:shd w:val="clear" w:color="auto" w:fill="FFFFFF"/>
-        </w:rPr>
-      </w:pPr>
-    </w:p>
-    <w:p>
-      <w:pPr>
-        <w:pStyle w:val="ListParagraph"/>
-        <w:ind w:left="480"/>
-        <w:rPr>
-          <w:rFonts w:ascii="Times New Roman" w:hAnsi="Times New Roman" w:cs="Times New Roman"/>
-          <w:color w:val="262626"/>
-          <w:shd w:val="clear" w:color="auto" w:fill="FFFFFF"/>
-        </w:rPr>
-      </w:pPr>
-      <w:r>
-        <w:rPr>
-          <w:rFonts w:ascii="Times New Roman" w:hAnsi="Times New Roman" w:cs="Times New Roman"/>
-          <w:color w:val="262626"/>
-          <w:shd w:val="clear" w:color="auto" w:fill="FFFFFF"/>
-        </w:rPr>
-        <w:t xml:space="preserve">Germany's appeal as a destination for </w:t>
-      </w:r>
-      <w:proofErr w:type="spellStart"/>
-      <w:r>
-        <w:rPr>
-          <w:rFonts w:ascii="Times New Roman" w:hAnsi="Times New Roman" w:cs="Times New Roman"/>
-          <w:color w:val="262626"/>
-          <w:shd w:val="clear" w:color="auto" w:fill="FFFFFF"/>
-        </w:rPr>
-        <w:t>GlobalWafers</w:t>
-      </w:r>
-      <w:proofErr w:type="spellEnd"/>
-      <w:r>
-        <w:rPr>
-          <w:rFonts w:ascii="Times New Roman" w:hAnsi="Times New Roman" w:cs="Times New Roman"/>
-          <w:color w:val="262626"/>
-          <w:shd w:val="clear" w:color="auto" w:fill="FFFFFF"/>
-        </w:rPr>
-        <w:t xml:space="preserve">' new manufacturing facility reflects the country's strengths in engineering, innovation, and skilled workforce. By establishing a presence in Germany, </w:t>
-      </w:r>
-      <w:proofErr w:type="spellStart"/>
-      <w:r>
-        <w:rPr>
-          <w:rFonts w:ascii="Times New Roman" w:hAnsi="Times New Roman" w:cs="Times New Roman"/>
-          <w:color w:val="262626"/>
-          <w:shd w:val="clear" w:color="auto" w:fill="FFFFFF"/>
-        </w:rPr>
-        <w:t>GlobalWafers</w:t>
-      </w:r>
-      <w:proofErr w:type="spellEnd"/>
-      <w:r>
-        <w:rPr>
-          <w:rFonts w:ascii="Times New Roman" w:hAnsi="Times New Roman" w:cs="Times New Roman"/>
-          <w:color w:val="262626"/>
-          <w:shd w:val="clear" w:color="auto" w:fill="FFFFFF"/>
-        </w:rPr>
-        <w:t xml:space="preserve"> aims to leverage these strengths to expand its production capacity and meet the growing demand for semiconductor chips in Europe and beyond.</w:t>
-      </w:r>
-    </w:p>
-    <w:p>
-      <w:pPr>
-        <w:pStyle w:val="ListParagraph"/>
-        <w:ind w:left="480"/>
-        <w:rPr>
-          <w:rFonts w:ascii="Times New Roman" w:hAnsi="Times New Roman" w:cs="Times New Roman"/>
-          <w:color w:val="262626"/>
-          <w:shd w:val="clear" w:color="auto" w:fill="FFFFFF"/>
-        </w:rPr>
-      </w:pPr>
-    </w:p>
-    <w:p>
-      <w:pPr>
-        <w:pStyle w:val="ListParagraph"/>
-        <w:ind w:left="480"/>
-        <w:rPr>
-          <w:rFonts w:ascii="Times New Roman" w:hAnsi="Times New Roman" w:cs="Times New Roman"/>
-          <w:color w:val="262626"/>
-          <w:shd w:val="clear" w:color="auto" w:fill="FFFFFF"/>
-        </w:rPr>
-      </w:pPr>
-      <w:r>
-        <w:rPr>
-          <w:rFonts w:ascii="Times New Roman" w:hAnsi="Times New Roman" w:cs="Times New Roman"/>
-          <w:color w:val="262626"/>
-          <w:shd w:val="clear" w:color="auto" w:fill="FFFFFF"/>
-        </w:rPr>
-        <w:t xml:space="preserve">From a broader perspective, the </w:t>
-      </w:r>
-      <w:proofErr w:type="spellStart"/>
-      <w:r>
-        <w:rPr>
-          <w:rFonts w:ascii="Times New Roman" w:hAnsi="Times New Roman" w:cs="Times New Roman"/>
-          <w:color w:val="262626"/>
-          <w:shd w:val="clear" w:color="auto" w:fill="FFFFFF"/>
-        </w:rPr>
-        <w:t>GlobalWafers</w:t>
-      </w:r>
-      <w:proofErr w:type="spellEnd"/>
-      <w:r>
-        <w:rPr>
-          <w:rFonts w:ascii="Times New Roman" w:hAnsi="Times New Roman" w:cs="Times New Roman"/>
-          <w:color w:val="262626"/>
-          <w:shd w:val="clear" w:color="auto" w:fill="FFFFFF"/>
-        </w:rPr>
-        <w:t xml:space="preserve"> move to Germany underscores the shifting dynamics of global tech competition and the rise of new players in the semiconductor industry. Traditionally dominated by companies in East Asia, particularly Taiwan, South Korea, and China, the semiconductor market is witnessing the emergence of new manufacturing hubs and players in Europe and North America.</w:t>
-      </w:r>
-    </w:p>
-    <w:p>
-      <w:pPr>
-        <w:pStyle w:val="ListParagraph"/>
-        <w:ind w:left="480"/>
-        <w:rPr>
-          <w:rFonts w:ascii="Times New Roman" w:hAnsi="Times New Roman" w:cs="Times New Roman"/>
-          <w:color w:val="262626"/>
-          <w:shd w:val="clear" w:color="auto" w:fill="FFFFFF"/>
-        </w:rPr>
-      </w:pPr>
-    </w:p>
-    <w:p>
-      <w:pPr>
-        <w:pStyle w:val="ListParagraph"/>
-        <w:ind w:left="480"/>
-        <w:rPr>
-          <w:rFonts w:ascii="Times New Roman" w:hAnsi="Times New Roman" w:cs="Times New Roman"/>
-          <w:color w:val="262626"/>
-          <w:shd w:val="clear" w:color="auto" w:fill="FFFFFF"/>
-        </w:rPr>
-      </w:pPr>
-      <w:r>
-        <w:rPr>
-          <w:rFonts w:ascii="Times New Roman" w:hAnsi="Times New Roman" w:cs="Times New Roman"/>
-          <w:color w:val="262626"/>
-          <w:shd w:val="clear" w:color="auto" w:fill="FFFFFF"/>
-        </w:rPr>
-        <w:t>This trend has significant implications for global supply chains, trade relations, and geopolitical dynamics. As countries vie for leadership in key technologies like semiconductors, competition and cooperation in the tech sector are increasingly shaped by considerations of economic competitiveness, national security, and strategic interests.</w:t>
-      </w:r>
-    </w:p>
-    <w:p>
-      <w:pPr>
-        <w:pStyle w:val="ListParagraph"/>
-        <w:ind w:left="480"/>
-        <w:rPr>
-          <w:rFonts w:ascii="Times New Roman" w:hAnsi="Times New Roman" w:cs="Times New Roman"/>
-          <w:color w:val="262626"/>
-          <w:shd w:val="clear" w:color="auto" w:fill="FFFFFF"/>
-        </w:rPr>
-      </w:pPr>
-    </w:p>
-    <w:p>
-      <w:pPr>
-        <w:pStyle w:val="ListParagraph"/>
-        <w:ind w:left="480"/>
-        <w:rPr>
-          <w:rFonts w:ascii="Times New Roman" w:hAnsi="Times New Roman" w:cs="Times New Roman"/>
-          <w:color w:val="262626"/>
-          <w:shd w:val="clear" w:color="auto" w:fill="FFFFFF"/>
-        </w:rPr>
-      </w:pPr>
-      <w:r>
-        <w:rPr>
-          <w:rFonts w:ascii="Times New Roman" w:hAnsi="Times New Roman" w:cs="Times New Roman"/>
-          <w:color w:val="262626"/>
-          <w:shd w:val="clear" w:color="auto" w:fill="FFFFFF"/>
-        </w:rPr>
-        <w:t xml:space="preserve">From a personal standpoint, the </w:t>
-      </w:r>
-      <w:proofErr w:type="spellStart"/>
-      <w:r>
-        <w:rPr>
-          <w:rFonts w:ascii="Times New Roman" w:hAnsi="Times New Roman" w:cs="Times New Roman"/>
-          <w:color w:val="262626"/>
-          <w:shd w:val="clear" w:color="auto" w:fill="FFFFFF"/>
-        </w:rPr>
-        <w:t>GlobalWafers</w:t>
-      </w:r>
-      <w:proofErr w:type="spellEnd"/>
-      <w:r>
-        <w:rPr>
-          <w:rFonts w:ascii="Times New Roman" w:hAnsi="Times New Roman" w:cs="Times New Roman"/>
-          <w:color w:val="262626"/>
-          <w:shd w:val="clear" w:color="auto" w:fill="FFFFFF"/>
-        </w:rPr>
-        <w:t xml:space="preserve"> move to Germany prompts reflection on the interconnectedness of global economies and the role of technology in driving innovation and economic growth. As consumers and </w:t>
-      </w:r>
-      <w:r>
-        <w:rPr>
-          <w:rFonts w:ascii="Times New Roman" w:hAnsi="Times New Roman" w:cs="Times New Roman"/>
-          <w:color w:val="262626"/>
-          <w:shd w:val="clear" w:color="auto" w:fill="FFFFFF"/>
-        </w:rPr>
-        <w:lastRenderedPageBreak/>
-        <w:t>citizens, we rely on semiconductor chips in virtually every aspect of our daily lives, from communication and transportation to healthcare and entertainment. Understanding the factors influencing semiconductor manufacturing decisions helps us appreciate the complexities of the global tech ecosystem and the implications for future technological advancements and societal progress.</w:t>
-      </w:r>
-    </w:p>
-    <w:p>
-      <w:pPr>
-        <w:pStyle w:val="ListParagraph"/>
-        <w:ind w:left="480"/>
-        <w:rPr>
-          <w:rFonts w:ascii="Times New Roman" w:hAnsi="Times New Roman" w:cs="Times New Roman"/>
-          <w:color w:val="262626"/>
-          <w:shd w:val="clear" w:color="auto" w:fill="FFFFFF"/>
-        </w:rPr>
-      </w:pPr>
-    </w:p>
-    <w:p>
-      <w:pPr>
-        <w:pStyle w:val="ListParagraph"/>
-        <w:ind w:left="480"/>
+          <w:color w:val="0F9ED5" w:themeColor="accent4"/>
+          <w:shd w:val="clear" w:color="auto" w:fill="FFFFFF"/>
+        </w:rPr>
+        <w:t>' decision to establish a manufacturing facility in Germany highlights the evolving nature of the semiconductor industry and the strategic importance of semiconductor manufacturing capabilities</w:t>
+      </w:r>
+      <w:r>
+        <w:rPr>
+          <w:rFonts w:ascii="Times New Roman" w:hAnsi="Times New Roman" w:cs="Times New Roman"/>
+          <w:color w:val="262626"/>
+          <w:shd w:val="clear" w:color="auto" w:fill="FFFFFF"/>
+        </w:rPr>
+        <w:t xml:space="preserve"> in today's interconnected world. As countries and companies navigate the challenges and opportunities of the digital age, collaboration, innovation, and strategic investments will be essential in shaping the future of technology and ensuring a more resilient and prosperous global economy</w:t>
+      </w:r>
+      <w:r>
         <w:rPr>
           <w:rFonts w:ascii="Times New Roman" w:hAnsi="Times New Roman" w:cs="Times New Roman" w:hint="eastAsia"/>
           <w:color w:val="262626"/>
           <w:shd w:val="clear" w:color="auto" w:fill="FFFFFF"/>
         </w:rPr>
-      </w:pPr>
-      <w:r>
-        <w:rPr>
-          <w:rFonts w:ascii="Times New Roman" w:hAnsi="Times New Roman" w:cs="Times New Roman"/>
-          <w:color w:val="262626"/>
-          <w:shd w:val="clear" w:color="auto" w:fill="FFFFFF"/>
-        </w:rPr>
-        <w:t xml:space="preserve">In conclusion, </w:t>
-      </w:r>
-      <w:proofErr w:type="spellStart"/>
-      <w:r>
-        <w:rPr>
-          <w:rFonts w:ascii="Times New Roman" w:hAnsi="Times New Roman" w:cs="Times New Roman"/>
-          <w:color w:val="262626"/>
-          <w:shd w:val="clear" w:color="auto" w:fill="FFFFFF"/>
-        </w:rPr>
-        <w:t>GlobalWafers</w:t>
-      </w:r>
-      <w:proofErr w:type="spellEnd"/>
-      <w:r>
-        <w:rPr>
-          <w:rFonts w:ascii="Times New Roman" w:hAnsi="Times New Roman" w:cs="Times New Roman"/>
-          <w:color w:val="262626"/>
-          <w:shd w:val="clear" w:color="auto" w:fill="FFFFFF"/>
-        </w:rPr>
-        <w:t>' decision to establish a manufacturing facility in Germany highlights the evolving nature of the semiconductor industry and the strategic importance of semiconductor manufacturing capabilities in today's interconnected world. As countries and companies navigate the challenges and opportunities of the digital age, collaboration, innovation, and strategic investments will be essential in shaping the future of technology and ensuring a more resilient and prosperous global economy.</w:t>
-      </w:r>
-    </w:p>
-    <w:p>
-      <w:pPr>
-        <w:pStyle w:val="ListParagraph"/>
-        <w:numPr>
-          <w:ilvl w:val="0"/>
-          <w:numId w:val="1"/>
-        </w:numPr>
-        <w:jc w:val="center"/>
-        <w:rPr>
-          <w:rFonts w:ascii="Times New Roman" w:eastAsia="標楷體" w:hAnsi="Times New Roman"/>
-          <w:sz w:val="36"/>
-          <w:szCs w:val="36"/>
-        </w:rPr>
-      </w:pPr>
-      <w:r>
-        <w:rPr>
-          <w:rFonts w:ascii="Times New Roman" w:eastAsia="標楷體" w:hAnsi="Times New Roman" w:hint="eastAsia"/>
-          <w:sz w:val="36"/>
-          <w:szCs w:val="36"/>
-        </w:rPr>
-        <w:t xml:space="preserve">The </w:t>
-      </w:r>
-      <w:r>
-        <w:rPr>
-          <w:rFonts w:ascii="Times New Roman" w:eastAsia="標楷體" w:hAnsi="Times New Roman"/>
-          <w:sz w:val="36"/>
-          <w:szCs w:val="36"/>
-        </w:rPr>
-        <w:t>econom</w:t>
-      </w:r>
-      <w:r>
-        <w:rPr>
-          <w:rFonts w:ascii="Times New Roman" w:eastAsia="標楷體" w:hAnsi="Times New Roman" w:hint="eastAsia"/>
-          <w:sz w:val="36"/>
-          <w:szCs w:val="36"/>
-        </w:rPr>
-        <w:t xml:space="preserve">y </w:t>
-      </w:r>
-      <w:r>
-        <w:rPr>
-          <w:rFonts w:ascii="Times New Roman" w:eastAsia="標楷體" w:hAnsi="Times New Roman"/>
-          <w:sz w:val="36"/>
-          <w:szCs w:val="36"/>
-        </w:rPr>
-        <w:t>of</w:t>
-      </w:r>
-      <w:r>
-        <w:rPr>
-          <w:rFonts w:ascii="Times New Roman" w:eastAsia="標楷體" w:hAnsi="Times New Roman" w:hint="eastAsia"/>
-          <w:sz w:val="36"/>
-          <w:szCs w:val="36"/>
-        </w:rPr>
-        <w:t xml:space="preserve"> Taiwan,</w:t>
-      </w:r>
-      <w:r>
-        <w:rPr>
-          <w:rFonts w:ascii="Times New Roman" w:eastAsia="標楷體" w:hAnsi="Times New Roman" w:hint="eastAsia"/>
-          <w:sz w:val="36"/>
-          <w:szCs w:val="36"/>
-        </w:rPr>
-        <w:t xml:space="preserve"> </w:t>
-      </w:r>
-      <w:r>
-        <w:rPr>
-          <w:rFonts w:ascii="Times New Roman" w:eastAsia="標楷體" w:hAnsi="Times New Roman" w:hint="eastAsia"/>
-          <w:sz w:val="36"/>
-          <w:szCs w:val="36"/>
-        </w:rPr>
-        <w:t xml:space="preserve">mainland China, </w:t>
-      </w:r>
-      <w:r>
-        <w:rPr>
-          <w:rFonts w:ascii="Times New Roman" w:eastAsia="標楷體" w:hAnsi="Times New Roman"/>
-          <w:sz w:val="36"/>
-          <w:szCs w:val="36"/>
-        </w:rPr>
-        <w:t xml:space="preserve">and </w:t>
-      </w:r>
-      <w:r>
-        <w:rPr>
-          <w:rFonts w:ascii="Times New Roman" w:eastAsia="標楷體" w:hAnsi="Times New Roman" w:hint="eastAsia"/>
-          <w:sz w:val="36"/>
-          <w:szCs w:val="36"/>
-        </w:rPr>
-        <w:t>Europe</w:t>
-      </w:r>
-      <w:r>
-        <w:rPr>
-          <w:rFonts w:ascii="Times New Roman" w:eastAsia="標楷體" w:hAnsi="Times New Roman" w:hint="eastAsia"/>
-          <w:sz w:val="36"/>
-          <w:szCs w:val="36"/>
-        </w:rPr>
-        <w:t>.</w:t>
-      </w:r>
-    </w:p>
-    <w:p>
-      <w:pPr>
-        <w:pStyle w:val="ListParagraph"/>
-        <w:ind w:left="480"/>
-        <w:rPr>
-          <w:rFonts w:ascii="Times New Roman" w:eastAsia="標楷體" w:hAnsi="Times New Roman" w:cs="Times New Roman"/>
-          <w:sz w:val="36"/>
-          <w:szCs w:val="36"/>
-        </w:rPr>
-      </w:pPr>
-      <w:r>
-        <w:rPr>
-          <w:rFonts w:ascii="Times New Roman" w:hAnsi="Times New Roman" w:cs="Times New Roman"/>
-          <w:color w:val="262626"/>
-          <w:shd w:val="clear" w:color="auto" w:fill="FFFFFF"/>
-        </w:rPr>
-        <w:t xml:space="preserve">The People’s Republic of China currently has severe economic problems to contend with that could also spill over to Germany. On top of that, relations between advanced economies in the West and China have worsened noticeably of late, as reflected in an uptick in trade and geopolitical tensions. The Bundesbank singles out geopolitical developments as a major source of risk to economic relations. “If these risks </w:t>
-      </w:r>
-      <w:proofErr w:type="spellStart"/>
-      <w:r>
-        <w:rPr>
-          <w:rFonts w:ascii="Times New Roman" w:hAnsi="Times New Roman" w:cs="Times New Roman"/>
-          <w:color w:val="262626"/>
-          <w:shd w:val="clear" w:color="auto" w:fill="FFFFFF"/>
-        </w:rPr>
-        <w:t>materialise</w:t>
-      </w:r>
-      <w:proofErr w:type="spellEnd"/>
-      <w:r>
-        <w:rPr>
-          <w:rFonts w:ascii="Times New Roman" w:hAnsi="Times New Roman" w:cs="Times New Roman"/>
-          <w:color w:val="262626"/>
-          <w:shd w:val="clear" w:color="auto" w:fill="FFFFFF"/>
-        </w:rPr>
-        <w:t xml:space="preserve">, Germany’s economy could take a huge hit,” the Bank’s experts write in an article exploring Germany’s dependence on China. The article </w:t>
-      </w:r>
-      <w:proofErr w:type="gramStart"/>
-      <w:r>
-        <w:rPr>
-          <w:rFonts w:ascii="Times New Roman" w:hAnsi="Times New Roman" w:cs="Times New Roman"/>
-          <w:color w:val="262626"/>
-          <w:shd w:val="clear" w:color="auto" w:fill="FFFFFF"/>
-        </w:rPr>
-        <w:t>looks into</w:t>
-      </w:r>
-      <w:proofErr w:type="gramEnd"/>
-      <w:r>
-        <w:rPr>
-          <w:rFonts w:ascii="Times New Roman" w:hAnsi="Times New Roman" w:cs="Times New Roman"/>
-          <w:color w:val="262626"/>
-          <w:shd w:val="clear" w:color="auto" w:fill="FFFFFF"/>
-        </w:rPr>
-        <w:t xml:space="preserve"> the extent to which Germany’s economy could cope with an economic crisis in China or an abrupt decoupling from that country. It also considers potential supply chain disruptions and, in particular, the risks to financial </w:t>
-      </w:r>
-      <w:proofErr w:type="gramStart"/>
-      <w:r>
-        <w:rPr>
-          <w:rFonts w:ascii="Times New Roman" w:hAnsi="Times New Roman" w:cs="Times New Roman"/>
-          <w:color w:val="262626"/>
-          <w:shd w:val="clear" w:color="auto" w:fill="FFFFFF"/>
-        </w:rPr>
-        <w:t>stability</w:t>
-      </w:r>
-      <w:proofErr w:type="gramEnd"/>
+        <w:t>!</w:t>
+      </w:r>
     </w:p>
     <w:p>
       <w:pPr>
         <w:widowControl/>
         <w:rPr>
-          <w:rFonts w:ascii="Times New Roman" w:eastAsia="標楷體" w:hAnsi="Times New Roman"/>
-          <w:sz w:val="36"/>
-          <w:szCs w:val="36"/>
-        </w:rPr>
-      </w:pPr>
-      <w:r>
-        <w:rPr>
-          <w:rFonts w:ascii="Times New Roman" w:eastAsia="標楷體" w:hAnsi="Times New Roman"/>
-          <w:sz w:val="36"/>
-          <w:szCs w:val="36"/>
+          <w:rFonts w:ascii="Times New Roman" w:hAnsi="Times New Roman" w:cs="Times New Roman"/>
+          <w:color w:val="262626"/>
+          <w:shd w:val="clear" w:color="auto" w:fill="FFFFFF"/>
+        </w:rPr>
+      </w:pPr>
+      <w:r>
+        <w:rPr>
+          <w:rFonts w:ascii="Times New Roman" w:hAnsi="Times New Roman" w:cs="Times New Roman"/>
+          <w:color w:val="262626"/>
+          <w:shd w:val="clear" w:color="auto" w:fill="FFFFFF"/>
         </w:rPr>
         <w:br w:type="page"/>
       </w:r>
     </w:p>
     <w:p>
       <w:pPr>
-        <w:jc w:val="center"/>
-        <w:rPr>
-          <w:rFonts w:ascii="Times New Roman" w:eastAsia="標楷體" w:hAnsi="Times New Roman"/>
-          <w:sz w:val="56"/>
-          <w:szCs w:val="56"/>
-        </w:rPr>
-      </w:pPr>
-      <w:r>
-        <w:rPr>
-          <w:rFonts w:ascii="Times New Roman" w:eastAsia="標楷體" w:hAnsi="Times New Roman" w:hint="eastAsia"/>
-          <w:sz w:val="56"/>
-          <w:szCs w:val="56"/>
+        <w:pStyle w:val="Heading1"/>
+        <w:rPr>
+          <w:sz w:val="40"/>
+          <w:szCs w:val="40"/>
+        </w:rPr>
+      </w:pPr>
+      <w:bookmarkStart w:id="3" w:name="_Toc170919534"/>
+      <w:r>
+        <w:rPr>
+          <w:rFonts w:hint="eastAsia"/>
+          <w:sz w:val="40"/>
+          <w:szCs w:val="40"/>
         </w:rPr>
         <w:lastRenderedPageBreak/>
         <w:t>Reference</w:t>
       </w:r>
+      <w:bookmarkEnd w:id="3"/>
     </w:p>
     <w:p>
       <w:pPr>
@@ -1186,17 +1728,13 @@
         </w:numPr>
         <w:rPr>
           <w:rFonts w:ascii="Times New Roman" w:eastAsia="標楷體" w:hAnsi="Times New Roman"/>
-          <w:sz w:val="32"/>
-          <w:szCs w:val="32"/>
-        </w:rPr>
-      </w:pPr>
-      <w:hyperlink r:id="rId7" w:history="1">
+        </w:rPr>
+      </w:pPr>
+      <w:hyperlink r:id="rId9" w:history="1">
         <w:r>
           <w:rPr>
             <w:rStyle w:val="Hyperlink"/>
             <w:rFonts w:ascii="Times New Roman" w:eastAsia="標楷體" w:hAnsi="Times New Roman"/>
-            <w:sz w:val="32"/>
-            <w:szCs w:val="32"/>
           </w:rPr>
           <w:t>https://www.wealth.com.tw/articles/0aa4acb1-89ba-4b56-9d36-9aac2cb6a4f5</w:t>
         </w:r>
@@ -1211,17 +1749,13 @@
         </w:numPr>
         <w:rPr>
           <w:rFonts w:ascii="Times New Roman" w:eastAsia="標楷體" w:hAnsi="Times New Roman"/>
-          <w:sz w:val="32"/>
-          <w:szCs w:val="32"/>
-        </w:rPr>
-      </w:pPr>
-      <w:hyperlink r:id="rId8" w:history="1">
+        </w:rPr>
+      </w:pPr>
+      <w:hyperlink r:id="rId10" w:history="1">
         <w:r>
           <w:rPr>
             <w:rStyle w:val="Hyperlink"/>
             <w:rFonts w:ascii="Times New Roman" w:eastAsia="標楷體" w:hAnsi="Times New Roman"/>
-            <w:sz w:val="32"/>
-            <w:szCs w:val="32"/>
           </w:rPr>
           <w:t>https://www.itweb.co.za/article/data-security-and-sovereignty-huawei-cloud-goes-to-great-lengths-to-protect-sa-data/WnpNgq21oolMVrGd</w:t>
         </w:r>
@@ -1236,17 +1770,13 @@
         </w:numPr>
         <w:rPr>
           <w:rFonts w:ascii="Times New Roman" w:eastAsia="標楷體" w:hAnsi="Times New Roman"/>
-          <w:sz w:val="32"/>
-          <w:szCs w:val="32"/>
-        </w:rPr>
-      </w:pPr>
-      <w:hyperlink r:id="rId9" w:history="1">
+        </w:rPr>
+      </w:pPr>
+      <w:hyperlink r:id="rId11" w:history="1">
         <w:r>
           <w:rPr>
             <w:rStyle w:val="Hyperlink"/>
             <w:rFonts w:ascii="Times New Roman" w:eastAsia="標楷體" w:hAnsi="Times New Roman"/>
-            <w:sz w:val="32"/>
-            <w:szCs w:val="32"/>
           </w:rPr>
           <w:t>https://english.cw.com.tw/article/article.action?id=3179</w:t>
         </w:r>
@@ -1261,24 +1791,20 @@
         </w:numPr>
         <w:rPr>
           <w:rFonts w:ascii="Times New Roman" w:eastAsia="標楷體" w:hAnsi="Times New Roman"/>
-          <w:sz w:val="32"/>
-          <w:szCs w:val="32"/>
-        </w:rPr>
-      </w:pPr>
-      <w:hyperlink r:id="rId10" w:history="1">
+        </w:rPr>
+      </w:pPr>
+      <w:hyperlink r:id="rId12" w:history="1">
         <w:r>
           <w:rPr>
             <w:rStyle w:val="Hyperlink"/>
             <w:rFonts w:ascii="Times New Roman" w:eastAsia="標楷體" w:hAnsi="Times New Roman"/>
-            <w:sz w:val="32"/>
-            <w:szCs w:val="32"/>
           </w:rPr>
           <w:t>https://www.bundesbank.de/en/tasks/topics/economic-risks-from-germany-s-ties-with-china-922490</w:t>
         </w:r>
       </w:hyperlink>
     </w:p>
     <w:sectPr>
-      <w:footerReference w:type="default" r:id="rId11"/>
+      <w:footerReference w:type="default" r:id="rId13"/>
       <w:pgSz w:w="11906" w:h="16838"/>
       <w:pgMar w:top="1440" w:right="1800" w:bottom="1440" w:left="1800" w:header="851" w:footer="992" w:gutter="0"/>
       <w:cols w:space="425"/>
@@ -2586,6 +3112,88 @@
       <w:u w:val="single"/>
     </w:rPr>
   </w:style>
+  <w:style w:type="character" w:styleId="CommentReference">
+    <w:name w:val="annotation reference"/>
+    <w:basedOn w:val="DefaultParagraphFont"/>
+    <w:uiPriority w:val="99"/>
+    <w:semiHidden/>
+    <w:unhideWhenUsed/>
+    <w:rsid w:val="008D249D"/>
+    <w:rPr>
+      <w:sz w:val="18"/>
+      <w:szCs w:val="18"/>
+    </w:rPr>
+  </w:style>
+  <w:style w:type="paragraph" w:styleId="CommentText">
+    <w:name w:val="annotation text"/>
+    <w:basedOn w:val="Normal"/>
+    <w:link w:val="CommentTextChar"/>
+    <w:uiPriority w:val="99"/>
+    <w:unhideWhenUsed/>
+    <w:rsid w:val="008D249D"/>
+  </w:style>
+  <w:style w:type="character" w:customStyle="1" w:styleId="CommentTextChar">
+    <w:name w:val="Comment Text Char"/>
+    <w:basedOn w:val="DefaultParagraphFont"/>
+    <w:link w:val="CommentText"/>
+    <w:uiPriority w:val="99"/>
+    <w:rsid w:val="008D249D"/>
+  </w:style>
+  <w:style w:type="paragraph" w:styleId="CommentSubject">
+    <w:name w:val="annotation subject"/>
+    <w:basedOn w:val="CommentText"/>
+    <w:next w:val="CommentText"/>
+    <w:link w:val="CommentSubjectChar"/>
+    <w:uiPriority w:val="99"/>
+    <w:semiHidden/>
+    <w:unhideWhenUsed/>
+    <w:rsid w:val="008D249D"/>
+    <w:rPr>
+      <w:b/>
+      <w:bCs/>
+    </w:rPr>
+  </w:style>
+  <w:style w:type="character" w:customStyle="1" w:styleId="CommentSubjectChar">
+    <w:name w:val="Comment Subject Char"/>
+    <w:basedOn w:val="CommentTextChar"/>
+    <w:link w:val="CommentSubject"/>
+    <w:uiPriority w:val="99"/>
+    <w:semiHidden/>
+    <w:rsid w:val="008D249D"/>
+    <w:rPr>
+      <w:b/>
+      <w:bCs/>
+    </w:rPr>
+  </w:style>
+  <w:style w:type="paragraph" w:styleId="TOCHeading">
+    <w:name w:val="TOC Heading"/>
+    <w:basedOn w:val="Heading1"/>
+    <w:next w:val="Normal"/>
+    <w:uiPriority w:val="39"/>
+    <w:unhideWhenUsed/>
+    <w:qFormat/>
+    <w:rsid w:val="009D0814"/>
+    <w:pPr>
+      <w:widowControl/>
+      <w:spacing w:before="240" w:after="0" w:line="259" w:lineRule="auto"/>
+      <w:outlineLvl w:val="9"/>
+    </w:pPr>
+    <w:rPr>
+      <w:kern w:val="0"/>
+      <w:sz w:val="32"/>
+      <w:szCs w:val="32"/>
+      <w:lang w:eastAsia="en-US"/>
+    </w:rPr>
+  </w:style>
+  <w:style w:type="paragraph" w:styleId="TOC1">
+    <w:name w:val="toc 1"/>
+    <w:basedOn w:val="Normal"/>
+    <w:next w:val="Normal"/>
+    <w:autoRedefine/>
+    <w:uiPriority w:val="39"/>
+    <w:unhideWhenUsed/>
+    <w:rsid w:val="009D0814"/>
+  </w:style>
 </w:styles>
 </file>
 
@@ -2882,4 +3490,16 @@
     </a:ext>
   </a:extLst>
 </a:theme>
+</file>
+
+<file path=customXml/item1.xml><?xml version="1.0" encoding="utf-8"?>
+<b:Sources xmlns:b="http://schemas.openxmlformats.org/officeDocument/2006/bibliography" xmlns="http://schemas.openxmlformats.org/officeDocument/2006/bibliography" SelectedStyle="\APASixthEditionOfficeOnline.xsl" StyleName="APA" Version="6"/>
+</file>
+
+<file path=customXml/itemProps1.xml><?xml version="1.0" encoding="utf-8"?>
+<ds:datastoreItem xmlns:ds="http://schemas.openxmlformats.org/officeDocument/2006/customXml" ds:itemID="{6A8BADE3-1D46-4F4C-B9AE-6AD2DEF4DA2B}">
+  <ds:schemaRefs>
+    <ds:schemaRef ds:uri="http://schemas.openxmlformats.org/officeDocument/2006/bibliography"/>
+  </ds:schemaRefs>
+</ds:datastoreItem>
 </file>
</xml_diff>